<commit_message>
Fix drop cap not rendering in Word; push chapter openers further down
The generated <w:framePr> never set w:wrap, so Word had no instruction to
flow the chapter's body paragraph around the drop-cap frame — it just left
the frame's reserved box empty and ran the rest of the text inline on the
same line. Adding wrap: FrameWrap.AROUND fixes it (verified in the raw
document.xml: w:wrap="around" now present on all 16 chapter drop caps).

Also increases the vertical space before each chapter's opener block
(SPACING.chapterOpenerBefore) so chapters start further down the page.

Co-Authored-By: Claude Sonnet 5 <noreply@anthropic.com>
Claude-Session: https://claude.ai/code/session_01EoaKHDQrpBesbDTJKhejKJ
</commit_message>
<xml_diff>
--- a/sample/Blessed-by-Association-formatted.docx
+++ b/sample/Blessed-by-Association-formatted.docx
@@ -235,7 +235,7 @@
     <w:p>
       <w:pPr>
         <w:pageBreakBefore/>
-        <w:spacing w:after="120" w:before="2030"/>
+        <w:spacing w:after="120" w:before="3720"/>
         <w:jc w:val="center"/>
       </w:pPr>
       <w:r>
@@ -302,7 +302,7 @@
     </w:p>
     <w:p>
       <w:pPr>
-        <w:framePr w:dropCap="drop" w:w="800" w:h="800" w:hAnchor="text" w:vAnchor="text" w:hRule="auto" w:xAlign="left" w:yAlign="top" w:lines="3"/>
+        <w:framePr w:dropCap="drop" w:w="800" w:h="800" w:hAnchor="text" w:vAnchor="text" w:hRule="auto" w:xAlign="left" w:yAlign="top" w:lines="3" w:wrap="around"/>
       </w:pPr>
       <w:r>
         <w:rPr>
@@ -521,7 +521,7 @@
     <w:p>
       <w:pPr>
         <w:pageBreakBefore/>
-        <w:spacing w:after="120" w:before="2030"/>
+        <w:spacing w:after="120" w:before="3720"/>
         <w:jc w:val="center"/>
       </w:pPr>
       <w:r>
@@ -588,7 +588,7 @@
     </w:p>
     <w:p>
       <w:pPr>
-        <w:framePr w:dropCap="drop" w:w="800" w:h="800" w:hAnchor="text" w:vAnchor="text" w:hRule="auto" w:xAlign="left" w:yAlign="top" w:lines="3"/>
+        <w:framePr w:dropCap="drop" w:w="800" w:h="800" w:hAnchor="text" w:vAnchor="text" w:hRule="auto" w:xAlign="left" w:yAlign="top" w:lines="3" w:wrap="around"/>
       </w:pPr>
       <w:r>
         <w:rPr>
@@ -1078,7 +1078,7 @@
     <w:p>
       <w:pPr>
         <w:pageBreakBefore/>
-        <w:spacing w:after="120" w:before="2030"/>
+        <w:spacing w:after="120" w:before="3720"/>
         <w:jc w:val="center"/>
       </w:pPr>
       <w:r>
@@ -1147,7 +1147,7 @@
     </w:p>
     <w:p>
       <w:pPr>
-        <w:framePr w:dropCap="drop" w:w="800" w:h="800" w:hAnchor="text" w:vAnchor="text" w:hRule="auto" w:xAlign="left" w:yAlign="top" w:lines="3"/>
+        <w:framePr w:dropCap="drop" w:w="800" w:h="800" w:hAnchor="text" w:vAnchor="text" w:hRule="auto" w:xAlign="left" w:yAlign="top" w:lines="3" w:wrap="around"/>
       </w:pPr>
       <w:r>
         <w:rPr>
@@ -1688,7 +1688,7 @@
     <w:p>
       <w:pPr>
         <w:pageBreakBefore/>
-        <w:spacing w:after="120" w:before="2030"/>
+        <w:spacing w:after="120" w:before="3720"/>
         <w:jc w:val="center"/>
       </w:pPr>
       <w:r>
@@ -1755,7 +1755,7 @@
     </w:p>
     <w:p>
       <w:pPr>
-        <w:framePr w:dropCap="drop" w:w="800" w:h="800" w:hAnchor="text" w:vAnchor="text" w:hRule="auto" w:xAlign="left" w:yAlign="top" w:lines="3"/>
+        <w:framePr w:dropCap="drop" w:w="800" w:h="800" w:hAnchor="text" w:vAnchor="text" w:hRule="auto" w:xAlign="left" w:yAlign="top" w:lines="3" w:wrap="around"/>
       </w:pPr>
       <w:r>
         <w:rPr>
@@ -2254,7 +2254,7 @@
     <w:p>
       <w:pPr>
         <w:pageBreakBefore/>
-        <w:spacing w:after="120" w:before="2030"/>
+        <w:spacing w:after="120" w:before="3720"/>
         <w:jc w:val="center"/>
       </w:pPr>
       <w:r>
@@ -2323,7 +2323,7 @@
     </w:p>
     <w:p>
       <w:pPr>
-        <w:framePr w:dropCap="drop" w:w="800" w:h="800" w:hAnchor="text" w:vAnchor="text" w:hRule="auto" w:xAlign="left" w:yAlign="top" w:lines="3"/>
+        <w:framePr w:dropCap="drop" w:w="800" w:h="800" w:hAnchor="text" w:vAnchor="text" w:hRule="auto" w:xAlign="left" w:yAlign="top" w:lines="3" w:wrap="around"/>
       </w:pPr>
       <w:r>
         <w:rPr>
@@ -2822,7 +2822,7 @@
     <w:p>
       <w:pPr>
         <w:pageBreakBefore/>
-        <w:spacing w:after="120" w:before="2030"/>
+        <w:spacing w:after="120" w:before="3720"/>
         <w:jc w:val="center"/>
       </w:pPr>
       <w:r>
@@ -2889,7 +2889,7 @@
     </w:p>
     <w:p>
       <w:pPr>
-        <w:framePr w:dropCap="drop" w:w="800" w:h="800" w:hAnchor="text" w:vAnchor="text" w:hRule="auto" w:xAlign="left" w:yAlign="top" w:lines="3"/>
+        <w:framePr w:dropCap="drop" w:w="800" w:h="800" w:hAnchor="text" w:vAnchor="text" w:hRule="auto" w:xAlign="left" w:yAlign="top" w:lines="3" w:wrap="around"/>
       </w:pPr>
       <w:r>
         <w:rPr>
@@ -3428,7 +3428,7 @@
     <w:p>
       <w:pPr>
         <w:pageBreakBefore/>
-        <w:spacing w:after="120" w:before="2030"/>
+        <w:spacing w:after="120" w:before="3720"/>
         <w:jc w:val="center"/>
       </w:pPr>
       <w:r>
@@ -3495,7 +3495,7 @@
     </w:p>
     <w:p>
       <w:pPr>
-        <w:framePr w:dropCap="drop" w:w="800" w:h="800" w:hAnchor="text" w:vAnchor="text" w:hRule="auto" w:xAlign="left" w:yAlign="top" w:lines="3"/>
+        <w:framePr w:dropCap="drop" w:w="800" w:h="800" w:hAnchor="text" w:vAnchor="text" w:hRule="auto" w:xAlign="left" w:yAlign="top" w:lines="3" w:wrap="around"/>
       </w:pPr>
       <w:r>
         <w:rPr>
@@ -4039,7 +4039,7 @@
     <w:p>
       <w:pPr>
         <w:pageBreakBefore/>
-        <w:spacing w:after="120" w:before="2030"/>
+        <w:spacing w:after="120" w:before="3720"/>
         <w:jc w:val="center"/>
       </w:pPr>
       <w:r>
@@ -4106,7 +4106,7 @@
     </w:p>
     <w:p>
       <w:pPr>
-        <w:framePr w:dropCap="drop" w:w="800" w:h="800" w:hAnchor="text" w:vAnchor="text" w:hRule="auto" w:xAlign="left" w:yAlign="top" w:lines="3"/>
+        <w:framePr w:dropCap="drop" w:w="800" w:h="800" w:hAnchor="text" w:vAnchor="text" w:hRule="auto" w:xAlign="left" w:yAlign="top" w:lines="3" w:wrap="around"/>
       </w:pPr>
       <w:r>
         <w:rPr>
@@ -4582,7 +4582,7 @@
     <w:p>
       <w:pPr>
         <w:pageBreakBefore/>
-        <w:spacing w:after="120" w:before="2030"/>
+        <w:spacing w:after="120" w:before="3720"/>
         <w:jc w:val="center"/>
       </w:pPr>
       <w:r>
@@ -4649,7 +4649,7 @@
     </w:p>
     <w:p>
       <w:pPr>
-        <w:framePr w:dropCap="drop" w:w="800" w:h="800" w:hAnchor="text" w:vAnchor="text" w:hRule="auto" w:xAlign="left" w:yAlign="top" w:lines="3"/>
+        <w:framePr w:dropCap="drop" w:w="800" w:h="800" w:hAnchor="text" w:vAnchor="text" w:hRule="auto" w:xAlign="left" w:yAlign="top" w:lines="3" w:wrap="around"/>
       </w:pPr>
       <w:r>
         <w:rPr>
@@ -5236,7 +5236,7 @@
     <w:p>
       <w:pPr>
         <w:pageBreakBefore/>
-        <w:spacing w:after="120" w:before="2030"/>
+        <w:spacing w:after="120" w:before="3720"/>
         <w:jc w:val="center"/>
       </w:pPr>
       <w:r>
@@ -5303,7 +5303,7 @@
     </w:p>
     <w:p>
       <w:pPr>
-        <w:framePr w:dropCap="drop" w:w="800" w:h="800" w:hAnchor="text" w:vAnchor="text" w:hRule="auto" w:xAlign="left" w:yAlign="top" w:lines="3"/>
+        <w:framePr w:dropCap="drop" w:w="800" w:h="800" w:hAnchor="text" w:vAnchor="text" w:hRule="auto" w:xAlign="left" w:yAlign="top" w:lines="3" w:wrap="around"/>
       </w:pPr>
       <w:r>
         <w:rPr>
@@ -5941,7 +5941,7 @@
     <w:p>
       <w:pPr>
         <w:pageBreakBefore/>
-        <w:spacing w:after="120" w:before="2030"/>
+        <w:spacing w:after="120" w:before="3720"/>
         <w:jc w:val="center"/>
       </w:pPr>
       <w:r>
@@ -6008,7 +6008,7 @@
     </w:p>
     <w:p>
       <w:pPr>
-        <w:framePr w:dropCap="drop" w:w="800" w:h="800" w:hAnchor="text" w:vAnchor="text" w:hRule="auto" w:xAlign="left" w:yAlign="top" w:lines="3"/>
+        <w:framePr w:dropCap="drop" w:w="800" w:h="800" w:hAnchor="text" w:vAnchor="text" w:hRule="auto" w:xAlign="left" w:yAlign="top" w:lines="3" w:wrap="around"/>
       </w:pPr>
       <w:r>
         <w:rPr>
@@ -6507,7 +6507,7 @@
     <w:p>
       <w:pPr>
         <w:pageBreakBefore/>
-        <w:spacing w:after="120" w:before="2030"/>
+        <w:spacing w:after="120" w:before="3720"/>
         <w:jc w:val="center"/>
       </w:pPr>
       <w:r>
@@ -6574,7 +6574,7 @@
     </w:p>
     <w:p>
       <w:pPr>
-        <w:framePr w:dropCap="drop" w:w="800" w:h="800" w:hAnchor="text" w:vAnchor="text" w:hRule="auto" w:xAlign="left" w:yAlign="top" w:lines="3"/>
+        <w:framePr w:dropCap="drop" w:w="800" w:h="800" w:hAnchor="text" w:vAnchor="text" w:hRule="auto" w:xAlign="left" w:yAlign="top" w:lines="3" w:wrap="around"/>
       </w:pPr>
       <w:r>
         <w:rPr>
@@ -7011,7 +7011,7 @@
     <w:p>
       <w:pPr>
         <w:pageBreakBefore/>
-        <w:spacing w:after="120" w:before="2030"/>
+        <w:spacing w:after="120" w:before="3720"/>
         <w:jc w:val="center"/>
       </w:pPr>
       <w:r>
@@ -7080,7 +7080,7 @@
     </w:p>
     <w:p>
       <w:pPr>
-        <w:framePr w:dropCap="drop" w:w="800" w:h="800" w:hAnchor="text" w:vAnchor="text" w:hRule="auto" w:xAlign="left" w:yAlign="top" w:lines="3"/>
+        <w:framePr w:dropCap="drop" w:w="800" w:h="800" w:hAnchor="text" w:vAnchor="text" w:hRule="auto" w:xAlign="left" w:yAlign="top" w:lines="3" w:wrap="around"/>
       </w:pPr>
       <w:r>
         <w:rPr>
@@ -7517,7 +7517,7 @@
     <w:p>
       <w:pPr>
         <w:pageBreakBefore/>
-        <w:spacing w:after="120" w:before="2030"/>
+        <w:spacing w:after="120" w:before="3720"/>
         <w:jc w:val="center"/>
       </w:pPr>
       <w:r>
@@ -7586,7 +7586,7 @@
     </w:p>
     <w:p>
       <w:pPr>
-        <w:framePr w:dropCap="drop" w:w="800" w:h="800" w:hAnchor="text" w:vAnchor="text" w:hRule="auto" w:xAlign="left" w:yAlign="top" w:lines="3"/>
+        <w:framePr w:dropCap="drop" w:w="800" w:h="800" w:hAnchor="text" w:vAnchor="text" w:hRule="auto" w:xAlign="left" w:yAlign="top" w:lines="3" w:wrap="around"/>
       </w:pPr>
       <w:r>
         <w:rPr>
@@ -8113,7 +8113,7 @@
     <w:p>
       <w:pPr>
         <w:pageBreakBefore/>
-        <w:spacing w:after="120" w:before="2030"/>
+        <w:spacing w:after="120" w:before="3720"/>
         <w:jc w:val="center"/>
       </w:pPr>
       <w:r>
@@ -8180,7 +8180,7 @@
     </w:p>
     <w:p>
       <w:pPr>
-        <w:framePr w:dropCap="drop" w:w="800" w:h="800" w:hAnchor="text" w:vAnchor="text" w:hRule="auto" w:xAlign="left" w:yAlign="top" w:lines="3"/>
+        <w:framePr w:dropCap="drop" w:w="800" w:h="800" w:hAnchor="text" w:vAnchor="text" w:hRule="auto" w:xAlign="left" w:yAlign="top" w:lines="3" w:wrap="around"/>
       </w:pPr>
       <w:r>
         <w:rPr>
@@ -8775,7 +8775,7 @@
     <w:p>
       <w:pPr>
         <w:pageBreakBefore/>
-        <w:spacing w:after="120" w:before="2030"/>
+        <w:spacing w:after="120" w:before="3720"/>
         <w:jc w:val="center"/>
       </w:pPr>
       <w:r>
@@ -8842,7 +8842,7 @@
     </w:p>
     <w:p>
       <w:pPr>
-        <w:framePr w:dropCap="drop" w:w="800" w:h="800" w:hAnchor="text" w:vAnchor="text" w:hRule="auto" w:xAlign="left" w:yAlign="top" w:lines="3"/>
+        <w:framePr w:dropCap="drop" w:w="800" w:h="800" w:hAnchor="text" w:vAnchor="text" w:hRule="auto" w:xAlign="left" w:yAlign="top" w:lines="3" w:wrap="around"/>
       </w:pPr>
       <w:r>
         <w:rPr>

</xml_diff>

<commit_message>
Add odd-page chapter starts, full justification; format "God's Ways"
build-book.js: each chapter is now its own Word section typed ODD_PAGE, so
Word inserts a blank page where needed to keep every chapter on a recto
page, instead of just breaking to the next page. All flowing body prose
(paragraphs, drop-cap text, block quotes, steps, prayer lines) is now fully
justified; centered elements (titles, epigraphs, headings) are unaffected.

Also generalizes the chapter renderer for manuscripts with no scripture
epigraph and in-chapter bold subheadings (reusing the existing small-caps
section-heading style), and adds convert-source-manuscript-gods-ways.py —
a classifier for "God's Ways" (Tina Suwa), whose scripture quotes are
inline italic-quote-plus-bold-citation pairs rather than a chapter-opening
epigraph.

Co-Authored-By: Claude Sonnet 5 <noreply@anthropic.com>
Claude-Session: https://claude.ai/code/session_01EoaKHDQrpBesbDTJKhejKJ
</commit_message>
<xml_diff>
--- a/sample/Blessed-by-Association-formatted.docx
+++ b/sample/Blessed-by-Association-formatted.docx
@@ -21,7 +21,7 @@
     </w:p>
     <w:p>
       <w:pPr>
-        <w:spacing w:after="300"/>
+        <w:spacing w:after="300" w:before="0"/>
         <w:jc w:val="center"/>
       </w:pPr>
       <w:r>
@@ -82,7 +82,6 @@
     </w:p>
     <w:p>
       <w:pPr>
-        <w:pageBreakBefore/>
         <w:spacing w:after="200" w:before="2000"/>
       </w:pPr>
       <w:r>
@@ -197,7 +196,6 @@
     </w:p>
     <w:p>
       <w:pPr>
-        <w:pageBreakBefore/>
         <w:spacing w:after="300" w:before="2000"/>
         <w:jc w:val="center"/>
       </w:pPr>
@@ -234,7 +232,17 @@
     </w:sdt>
     <w:p>
       <w:pPr>
-        <w:pageBreakBefore/>
+        <w:sectPr>
+          <w:footerReference w:type="default" r:id="rId7"/>
+          <w:pgSz w:w="8640" w:h="12960" w:orient="portrait"/>
+          <w:pgMar w:top="1152" w:right="1080" w:bottom="1080" w:left="1080" w:header="576" w:footer="576" w:gutter="0"/>
+          <w:pgNumType/>
+          <w:docGrid w:linePitch="360"/>
+        </w:sectPr>
+      </w:pPr>
+    </w:p>
+    <w:p>
+      <w:pPr>
         <w:spacing w:after="120" w:before="3720"/>
         <w:jc w:val="center"/>
       </w:pPr>
@@ -315,6 +323,7 @@
     <w:p>
       <w:pPr>
         <w:spacing w:after="160"/>
+        <w:jc w:val="both"/>
       </w:pPr>
       <w:r>
         <w:rPr>
@@ -329,6 +338,7 @@
     <w:p>
       <w:pPr>
         <w:spacing w:after="160"/>
+        <w:jc w:val="both"/>
       </w:pPr>
       <w:r>
         <w:rPr>
@@ -343,6 +353,7 @@
     <w:p>
       <w:pPr>
         <w:spacing w:after="160"/>
+        <w:jc w:val="both"/>
       </w:pPr>
       <w:r>
         <w:rPr>
@@ -357,6 +368,7 @@
     <w:p>
       <w:pPr>
         <w:spacing w:after="160"/>
+        <w:jc w:val="both"/>
       </w:pPr>
       <w:r>
         <w:rPr>
@@ -386,6 +398,7 @@
     <w:p>
       <w:pPr>
         <w:spacing w:after="160"/>
+        <w:jc w:val="both"/>
       </w:pPr>
       <w:r>
         <w:rPr>
@@ -400,6 +413,7 @@
     <w:p>
       <w:pPr>
         <w:spacing w:after="160"/>
+        <w:jc w:val="both"/>
       </w:pPr>
       <w:r>
         <w:rPr>
@@ -414,6 +428,7 @@
     <w:p>
       <w:pPr>
         <w:spacing w:after="160"/>
+        <w:jc w:val="both"/>
       </w:pPr>
       <w:r>
         <w:rPr>
@@ -428,6 +443,7 @@
     <w:p>
       <w:pPr>
         <w:spacing w:after="160"/>
+        <w:jc w:val="both"/>
       </w:pPr>
       <w:r>
         <w:rPr>
@@ -442,6 +458,7 @@
     <w:p>
       <w:pPr>
         <w:spacing w:after="160"/>
+        <w:jc w:val="both"/>
       </w:pPr>
       <w:r>
         <w:rPr>
@@ -505,6 +522,7 @@
     <w:p>
       <w:pPr>
         <w:spacing w:after="160"/>
+        <w:jc w:val="both"/>
       </w:pPr>
       <w:r>
         <w:rPr>
@@ -520,7 +538,18 @@
     </w:p>
     <w:p>
       <w:pPr>
-        <w:pageBreakBefore/>
+        <w:sectPr>
+          <w:footerReference w:type="default" r:id="rId8"/>
+          <w:type w:val="oddPage"/>
+          <w:pgSz w:w="8640" w:h="12960" w:orient="portrait"/>
+          <w:pgMar w:top="1152" w:right="1080" w:bottom="1080" w:left="1080" w:header="576" w:footer="576" w:gutter="0"/>
+          <w:pgNumType/>
+          <w:docGrid w:linePitch="360"/>
+        </w:sectPr>
+      </w:pPr>
+    </w:p>
+    <w:p>
+      <w:pPr>
         <w:spacing w:after="120" w:before="3720"/>
         <w:jc w:val="center"/>
       </w:pPr>
@@ -601,6 +630,7 @@
     <w:p>
       <w:pPr>
         <w:spacing w:after="160"/>
+        <w:jc w:val="both"/>
       </w:pPr>
       <w:r>
         <w:rPr>
@@ -615,6 +645,7 @@
     <w:p>
       <w:pPr>
         <w:spacing w:after="160"/>
+        <w:jc w:val="both"/>
       </w:pPr>
       <w:r>
         <w:rPr>
@@ -629,6 +660,7 @@
     <w:p>
       <w:pPr>
         <w:spacing w:after="160"/>
+        <w:jc w:val="both"/>
       </w:pPr>
       <w:r>
         <w:rPr>
@@ -644,6 +676,7 @@
       <w:pPr>
         <w:spacing w:after="60" w:before="200"/>
         <w:ind w:left="360" w:right="360"/>
+        <w:jc w:val="both"/>
       </w:pPr>
       <w:r>
         <w:rPr>
@@ -677,6 +710,7 @@
     <w:p>
       <w:pPr>
         <w:spacing w:after="160"/>
+        <w:jc w:val="both"/>
       </w:pPr>
       <w:r>
         <w:rPr>
@@ -691,6 +725,7 @@
     <w:p>
       <w:pPr>
         <w:spacing w:after="160"/>
+        <w:jc w:val="both"/>
       </w:pPr>
       <w:r>
         <w:rPr>
@@ -706,6 +741,7 @@
       <w:pPr>
         <w:spacing w:after="60" w:before="200"/>
         <w:ind w:left="360" w:right="360"/>
+        <w:jc w:val="both"/>
       </w:pPr>
       <w:r>
         <w:rPr>
@@ -739,6 +775,7 @@
     <w:p>
       <w:pPr>
         <w:spacing w:after="160"/>
+        <w:jc w:val="both"/>
       </w:pPr>
       <w:r>
         <w:rPr>
@@ -768,6 +805,7 @@
     <w:p>
       <w:pPr>
         <w:spacing w:after="160"/>
+        <w:jc w:val="both"/>
       </w:pPr>
       <w:r>
         <w:rPr>
@@ -782,6 +820,7 @@
     <w:p>
       <w:pPr>
         <w:spacing w:after="160"/>
+        <w:jc w:val="both"/>
       </w:pPr>
       <w:r>
         <w:rPr>
@@ -796,6 +835,7 @@
     <w:p>
       <w:pPr>
         <w:spacing w:after="160"/>
+        <w:jc w:val="both"/>
       </w:pPr>
       <w:r>
         <w:rPr>
@@ -810,6 +850,7 @@
     <w:p>
       <w:pPr>
         <w:spacing w:after="160"/>
+        <w:jc w:val="both"/>
       </w:pPr>
       <w:r>
         <w:rPr>
@@ -918,6 +959,7 @@
       <w:pPr>
         <w:spacing w:after="80"/>
         <w:ind w:left="400" w:hanging="260"/>
+        <w:jc w:val="both"/>
       </w:pPr>
       <w:r>
         <w:rPr>
@@ -942,6 +984,7 @@
       <w:pPr>
         <w:spacing w:after="80"/>
         <w:ind w:left="400" w:hanging="260"/>
+        <w:jc w:val="both"/>
       </w:pPr>
       <w:r>
         <w:rPr>
@@ -966,6 +1009,7 @@
       <w:pPr>
         <w:spacing w:after="80"/>
         <w:ind w:left="400" w:hanging="260"/>
+        <w:jc w:val="both"/>
       </w:pPr>
       <w:r>
         <w:rPr>
@@ -990,6 +1034,7 @@
       <w:pPr>
         <w:spacing w:after="80"/>
         <w:ind w:left="400" w:hanging="260"/>
+        <w:jc w:val="both"/>
       </w:pPr>
       <w:r>
         <w:rPr>
@@ -1062,6 +1107,7 @@
     <w:p>
       <w:pPr>
         <w:spacing w:after="160"/>
+        <w:jc w:val="both"/>
       </w:pPr>
       <w:r>
         <w:rPr>
@@ -1077,7 +1123,18 @@
     </w:p>
     <w:p>
       <w:pPr>
-        <w:pageBreakBefore/>
+        <w:sectPr>
+          <w:footerReference w:type="default" r:id="rId9"/>
+          <w:type w:val="oddPage"/>
+          <w:pgSz w:w="8640" w:h="12960" w:orient="portrait"/>
+          <w:pgMar w:top="1152" w:right="1080" w:bottom="1080" w:left="1080" w:header="576" w:footer="576" w:gutter="0"/>
+          <w:pgNumType/>
+          <w:docGrid w:linePitch="360"/>
+        </w:sectPr>
+      </w:pPr>
+    </w:p>
+    <w:p>
+      <w:pPr>
         <w:spacing w:after="120" w:before="3720"/>
         <w:jc w:val="center"/>
       </w:pPr>
@@ -1160,6 +1217,7 @@
     <w:p>
       <w:pPr>
         <w:spacing w:after="160"/>
+        <w:jc w:val="both"/>
       </w:pPr>
       <w:r>
         <w:rPr>
@@ -1174,6 +1232,7 @@
     <w:p>
       <w:pPr>
         <w:spacing w:after="160"/>
+        <w:jc w:val="both"/>
       </w:pPr>
       <w:r>
         <w:rPr>
@@ -1188,6 +1247,7 @@
     <w:p>
       <w:pPr>
         <w:spacing w:after="160"/>
+        <w:jc w:val="both"/>
       </w:pPr>
       <w:r>
         <w:rPr>
@@ -1202,6 +1262,7 @@
     <w:p>
       <w:pPr>
         <w:spacing w:after="160"/>
+        <w:jc w:val="both"/>
       </w:pPr>
       <w:r>
         <w:rPr>
@@ -1231,6 +1292,7 @@
     <w:p>
       <w:pPr>
         <w:spacing w:after="160"/>
+        <w:jc w:val="both"/>
       </w:pPr>
       <w:r>
         <w:rPr>
@@ -1245,6 +1307,7 @@
     <w:p>
       <w:pPr>
         <w:spacing w:after="160"/>
+        <w:jc w:val="both"/>
       </w:pPr>
       <w:r>
         <w:rPr>
@@ -1259,6 +1322,7 @@
     <w:p>
       <w:pPr>
         <w:spacing w:after="160"/>
+        <w:jc w:val="both"/>
       </w:pPr>
       <w:r>
         <w:rPr>
@@ -1273,6 +1337,7 @@
     <w:p>
       <w:pPr>
         <w:spacing w:after="160"/>
+        <w:jc w:val="both"/>
       </w:pPr>
       <w:r>
         <w:rPr>
@@ -1288,6 +1353,7 @@
       <w:pPr>
         <w:spacing w:after="60" w:before="200"/>
         <w:ind w:left="360" w:right="360"/>
+        <w:jc w:val="both"/>
       </w:pPr>
       <w:r>
         <w:rPr>
@@ -1321,6 +1387,7 @@
     <w:p>
       <w:pPr>
         <w:spacing w:after="160"/>
+        <w:jc w:val="both"/>
       </w:pPr>
       <w:r>
         <w:rPr>
@@ -1335,6 +1402,7 @@
     <w:p>
       <w:pPr>
         <w:spacing w:after="160"/>
+        <w:jc w:val="both"/>
       </w:pPr>
       <w:r>
         <w:rPr>
@@ -1364,6 +1432,7 @@
     <w:p>
       <w:pPr>
         <w:spacing w:after="160"/>
+        <w:jc w:val="both"/>
       </w:pPr>
       <w:r>
         <w:rPr>
@@ -1378,6 +1447,7 @@
     <w:p>
       <w:pPr>
         <w:spacing w:after="160"/>
+        <w:jc w:val="both"/>
       </w:pPr>
       <w:r>
         <w:rPr>
@@ -1392,6 +1462,7 @@
     <w:p>
       <w:pPr>
         <w:spacing w:after="160"/>
+        <w:jc w:val="both"/>
       </w:pPr>
       <w:r>
         <w:rPr>
@@ -1406,6 +1477,7 @@
     <w:p>
       <w:pPr>
         <w:spacing w:after="160"/>
+        <w:jc w:val="both"/>
       </w:pPr>
       <w:r>
         <w:rPr>
@@ -1420,6 +1492,7 @@
     <w:p>
       <w:pPr>
         <w:spacing w:after="160"/>
+        <w:jc w:val="both"/>
       </w:pPr>
       <w:r>
         <w:rPr>
@@ -1528,6 +1601,7 @@
       <w:pPr>
         <w:spacing w:after="80"/>
         <w:ind w:left="400" w:hanging="260"/>
+        <w:jc w:val="both"/>
       </w:pPr>
       <w:r>
         <w:rPr>
@@ -1552,6 +1626,7 @@
       <w:pPr>
         <w:spacing w:after="80"/>
         <w:ind w:left="400" w:hanging="260"/>
+        <w:jc w:val="both"/>
       </w:pPr>
       <w:r>
         <w:rPr>
@@ -1576,6 +1651,7 @@
       <w:pPr>
         <w:spacing w:after="80"/>
         <w:ind w:left="400" w:hanging="260"/>
+        <w:jc w:val="both"/>
       </w:pPr>
       <w:r>
         <w:rPr>
@@ -1600,6 +1676,7 @@
       <w:pPr>
         <w:spacing w:after="80"/>
         <w:ind w:left="400" w:hanging="260"/>
+        <w:jc w:val="both"/>
       </w:pPr>
       <w:r>
         <w:rPr>
@@ -1672,6 +1749,7 @@
     <w:p>
       <w:pPr>
         <w:spacing w:after="160"/>
+        <w:jc w:val="both"/>
       </w:pPr>
       <w:r>
         <w:rPr>
@@ -1687,7 +1765,18 @@
     </w:p>
     <w:p>
       <w:pPr>
-        <w:pageBreakBefore/>
+        <w:sectPr>
+          <w:footerReference w:type="default" r:id="rId10"/>
+          <w:type w:val="oddPage"/>
+          <w:pgSz w:w="8640" w:h="12960" w:orient="portrait"/>
+          <w:pgMar w:top="1152" w:right="1080" w:bottom="1080" w:left="1080" w:header="576" w:footer="576" w:gutter="0"/>
+          <w:pgNumType/>
+          <w:docGrid w:linePitch="360"/>
+        </w:sectPr>
+      </w:pPr>
+    </w:p>
+    <w:p>
+      <w:pPr>
         <w:spacing w:after="120" w:before="3720"/>
         <w:jc w:val="center"/>
       </w:pPr>
@@ -1768,6 +1857,7 @@
     <w:p>
       <w:pPr>
         <w:spacing w:after="160"/>
+        <w:jc w:val="both"/>
       </w:pPr>
       <w:r>
         <w:rPr>
@@ -1782,6 +1872,7 @@
     <w:p>
       <w:pPr>
         <w:spacing w:after="160"/>
+        <w:jc w:val="both"/>
       </w:pPr>
       <w:r>
         <w:rPr>
@@ -1796,6 +1887,7 @@
     <w:p>
       <w:pPr>
         <w:spacing w:after="160"/>
+        <w:jc w:val="both"/>
       </w:pPr>
       <w:r>
         <w:rPr>
@@ -1825,6 +1917,7 @@
     <w:p>
       <w:pPr>
         <w:spacing w:after="160"/>
+        <w:jc w:val="both"/>
       </w:pPr>
       <w:r>
         <w:rPr>
@@ -1839,6 +1932,7 @@
     <w:p>
       <w:pPr>
         <w:spacing w:after="160"/>
+        <w:jc w:val="both"/>
       </w:pPr>
       <w:r>
         <w:rPr>
@@ -1853,6 +1947,7 @@
     <w:p>
       <w:pPr>
         <w:spacing w:after="160"/>
+        <w:jc w:val="both"/>
       </w:pPr>
       <w:r>
         <w:rPr>
@@ -1867,6 +1962,7 @@
     <w:p>
       <w:pPr>
         <w:spacing w:after="160"/>
+        <w:jc w:val="both"/>
       </w:pPr>
       <w:r>
         <w:rPr>
@@ -1882,6 +1978,7 @@
       <w:pPr>
         <w:spacing w:after="60" w:before="200"/>
         <w:ind w:left="360" w:right="360"/>
+        <w:jc w:val="both"/>
       </w:pPr>
       <w:r>
         <w:rPr>
@@ -1915,6 +2012,7 @@
     <w:p>
       <w:pPr>
         <w:spacing w:after="160"/>
+        <w:jc w:val="both"/>
       </w:pPr>
       <w:r>
         <w:rPr>
@@ -1944,6 +2042,7 @@
     <w:p>
       <w:pPr>
         <w:spacing w:after="160"/>
+        <w:jc w:val="both"/>
       </w:pPr>
       <w:r>
         <w:rPr>
@@ -1958,6 +2057,7 @@
     <w:p>
       <w:pPr>
         <w:spacing w:after="160"/>
+        <w:jc w:val="both"/>
       </w:pPr>
       <w:r>
         <w:rPr>
@@ -1972,6 +2072,7 @@
     <w:p>
       <w:pPr>
         <w:spacing w:after="160"/>
+        <w:jc w:val="both"/>
       </w:pPr>
       <w:r>
         <w:rPr>
@@ -1986,6 +2087,7 @@
     <w:p>
       <w:pPr>
         <w:spacing w:after="160"/>
+        <w:jc w:val="both"/>
       </w:pPr>
       <w:r>
         <w:rPr>
@@ -2094,6 +2196,7 @@
       <w:pPr>
         <w:spacing w:after="80"/>
         <w:ind w:left="400" w:hanging="260"/>
+        <w:jc w:val="both"/>
       </w:pPr>
       <w:r>
         <w:rPr>
@@ -2118,6 +2221,7 @@
       <w:pPr>
         <w:spacing w:after="80"/>
         <w:ind w:left="400" w:hanging="260"/>
+        <w:jc w:val="both"/>
       </w:pPr>
       <w:r>
         <w:rPr>
@@ -2142,6 +2246,7 @@
       <w:pPr>
         <w:spacing w:after="80"/>
         <w:ind w:left="400" w:hanging="260"/>
+        <w:jc w:val="both"/>
       </w:pPr>
       <w:r>
         <w:rPr>
@@ -2166,6 +2271,7 @@
       <w:pPr>
         <w:spacing w:after="80"/>
         <w:ind w:left="400" w:hanging="260"/>
+        <w:jc w:val="both"/>
       </w:pPr>
       <w:r>
         <w:rPr>
@@ -2238,6 +2344,7 @@
     <w:p>
       <w:pPr>
         <w:spacing w:after="160"/>
+        <w:jc w:val="both"/>
       </w:pPr>
       <w:r>
         <w:rPr>
@@ -2253,7 +2360,18 @@
     </w:p>
     <w:p>
       <w:pPr>
-        <w:pageBreakBefore/>
+        <w:sectPr>
+          <w:footerReference w:type="default" r:id="rId11"/>
+          <w:type w:val="oddPage"/>
+          <w:pgSz w:w="8640" w:h="12960" w:orient="portrait"/>
+          <w:pgMar w:top="1152" w:right="1080" w:bottom="1080" w:left="1080" w:header="576" w:footer="576" w:gutter="0"/>
+          <w:pgNumType/>
+          <w:docGrid w:linePitch="360"/>
+        </w:sectPr>
+      </w:pPr>
+    </w:p>
+    <w:p>
+      <w:pPr>
         <w:spacing w:after="120" w:before="3720"/>
         <w:jc w:val="center"/>
       </w:pPr>
@@ -2336,6 +2454,7 @@
     <w:p>
       <w:pPr>
         <w:spacing w:after="160"/>
+        <w:jc w:val="both"/>
       </w:pPr>
       <w:r>
         <w:rPr>
@@ -2350,6 +2469,7 @@
     <w:p>
       <w:pPr>
         <w:spacing w:after="160"/>
+        <w:jc w:val="both"/>
       </w:pPr>
       <w:r>
         <w:rPr>
@@ -2364,6 +2484,7 @@
     <w:p>
       <w:pPr>
         <w:spacing w:after="160"/>
+        <w:jc w:val="both"/>
       </w:pPr>
       <w:r>
         <w:rPr>
@@ -2378,6 +2499,7 @@
     <w:p>
       <w:pPr>
         <w:spacing w:after="160"/>
+        <w:jc w:val="both"/>
       </w:pPr>
       <w:r>
         <w:rPr>
@@ -2407,6 +2529,7 @@
     <w:p>
       <w:pPr>
         <w:spacing w:after="160"/>
+        <w:jc w:val="both"/>
       </w:pPr>
       <w:r>
         <w:rPr>
@@ -2421,6 +2544,7 @@
     <w:p>
       <w:pPr>
         <w:spacing w:after="160"/>
+        <w:jc w:val="both"/>
       </w:pPr>
       <w:r>
         <w:rPr>
@@ -2435,6 +2559,7 @@
     <w:p>
       <w:pPr>
         <w:spacing w:after="160"/>
+        <w:jc w:val="both"/>
       </w:pPr>
       <w:r>
         <w:rPr>
@@ -2464,6 +2589,7 @@
     <w:p>
       <w:pPr>
         <w:spacing w:after="160"/>
+        <w:jc w:val="both"/>
       </w:pPr>
       <w:r>
         <w:rPr>
@@ -2478,6 +2604,7 @@
     <w:p>
       <w:pPr>
         <w:spacing w:after="160"/>
+        <w:jc w:val="both"/>
       </w:pPr>
       <w:r>
         <w:rPr>
@@ -2492,6 +2619,7 @@
     <w:p>
       <w:pPr>
         <w:spacing w:after="160"/>
+        <w:jc w:val="both"/>
       </w:pPr>
       <w:r>
         <w:rPr>
@@ -2507,6 +2635,7 @@
       <w:pPr>
         <w:spacing w:after="60" w:before="200"/>
         <w:ind w:left="360" w:right="360"/>
+        <w:jc w:val="both"/>
       </w:pPr>
       <w:r>
         <w:rPr>
@@ -2540,6 +2669,7 @@
     <w:p>
       <w:pPr>
         <w:spacing w:after="160"/>
+        <w:jc w:val="both"/>
       </w:pPr>
       <w:r>
         <w:rPr>
@@ -2554,6 +2684,7 @@
     <w:p>
       <w:pPr>
         <w:spacing w:after="160"/>
+        <w:jc w:val="both"/>
       </w:pPr>
       <w:r>
         <w:rPr>
@@ -2662,6 +2793,7 @@
       <w:pPr>
         <w:spacing w:after="80"/>
         <w:ind w:left="400" w:hanging="260"/>
+        <w:jc w:val="both"/>
       </w:pPr>
       <w:r>
         <w:rPr>
@@ -2686,6 +2818,7 @@
       <w:pPr>
         <w:spacing w:after="80"/>
         <w:ind w:left="400" w:hanging="260"/>
+        <w:jc w:val="both"/>
       </w:pPr>
       <w:r>
         <w:rPr>
@@ -2710,6 +2843,7 @@
       <w:pPr>
         <w:spacing w:after="80"/>
         <w:ind w:left="400" w:hanging="260"/>
+        <w:jc w:val="both"/>
       </w:pPr>
       <w:r>
         <w:rPr>
@@ -2734,6 +2868,7 @@
       <w:pPr>
         <w:spacing w:after="80"/>
         <w:ind w:left="400" w:hanging="260"/>
+        <w:jc w:val="both"/>
       </w:pPr>
       <w:r>
         <w:rPr>
@@ -2806,6 +2941,7 @@
     <w:p>
       <w:pPr>
         <w:spacing w:after="160"/>
+        <w:jc w:val="both"/>
       </w:pPr>
       <w:r>
         <w:rPr>
@@ -2821,7 +2957,18 @@
     </w:p>
     <w:p>
       <w:pPr>
-        <w:pageBreakBefore/>
+        <w:sectPr>
+          <w:footerReference w:type="default" r:id="rId12"/>
+          <w:type w:val="oddPage"/>
+          <w:pgSz w:w="8640" w:h="12960" w:orient="portrait"/>
+          <w:pgMar w:top="1152" w:right="1080" w:bottom="1080" w:left="1080" w:header="576" w:footer="576" w:gutter="0"/>
+          <w:pgNumType/>
+          <w:docGrid w:linePitch="360"/>
+        </w:sectPr>
+      </w:pPr>
+    </w:p>
+    <w:p>
+      <w:pPr>
         <w:spacing w:after="120" w:before="3720"/>
         <w:jc w:val="center"/>
       </w:pPr>
@@ -2902,6 +3049,7 @@
     <w:p>
       <w:pPr>
         <w:spacing w:after="160"/>
+        <w:jc w:val="both"/>
       </w:pPr>
       <w:r>
         <w:rPr>
@@ -2917,6 +3065,7 @@
       <w:pPr>
         <w:spacing w:after="60" w:before="200"/>
         <w:ind w:left="360" w:right="360"/>
+        <w:jc w:val="both"/>
       </w:pPr>
       <w:r>
         <w:rPr>
@@ -2950,6 +3099,7 @@
     <w:p>
       <w:pPr>
         <w:spacing w:after="160"/>
+        <w:jc w:val="both"/>
       </w:pPr>
       <w:r>
         <w:rPr>
@@ -2964,6 +3114,7 @@
     <w:p>
       <w:pPr>
         <w:spacing w:after="160"/>
+        <w:jc w:val="both"/>
       </w:pPr>
       <w:r>
         <w:rPr>
@@ -2993,6 +3144,7 @@
     <w:p>
       <w:pPr>
         <w:spacing w:after="160"/>
+        <w:jc w:val="both"/>
       </w:pPr>
       <w:r>
         <w:rPr>
@@ -3008,6 +3160,7 @@
       <w:pPr>
         <w:spacing w:after="60" w:before="200"/>
         <w:ind w:left="360" w:right="360"/>
+        <w:jc w:val="both"/>
       </w:pPr>
       <w:r>
         <w:rPr>
@@ -3041,6 +3194,7 @@
     <w:p>
       <w:pPr>
         <w:spacing w:after="160"/>
+        <w:jc w:val="both"/>
       </w:pPr>
       <w:r>
         <w:rPr>
@@ -3055,6 +3209,7 @@
     <w:p>
       <w:pPr>
         <w:spacing w:after="160"/>
+        <w:jc w:val="both"/>
       </w:pPr>
       <w:r>
         <w:rPr>
@@ -3069,6 +3224,7 @@
     <w:p>
       <w:pPr>
         <w:spacing w:after="160"/>
+        <w:jc w:val="both"/>
       </w:pPr>
       <w:r>
         <w:rPr>
@@ -3098,6 +3254,7 @@
     <w:p>
       <w:pPr>
         <w:spacing w:after="160"/>
+        <w:jc w:val="both"/>
       </w:pPr>
       <w:r>
         <w:rPr>
@@ -3113,6 +3270,7 @@
       <w:pPr>
         <w:spacing w:after="60" w:before="200"/>
         <w:ind w:left="360" w:right="360"/>
+        <w:jc w:val="both"/>
       </w:pPr>
       <w:r>
         <w:rPr>
@@ -3146,6 +3304,7 @@
     <w:p>
       <w:pPr>
         <w:spacing w:after="160"/>
+        <w:jc w:val="both"/>
       </w:pPr>
       <w:r>
         <w:rPr>
@@ -3160,6 +3319,7 @@
     <w:p>
       <w:pPr>
         <w:spacing w:after="160"/>
+        <w:jc w:val="both"/>
       </w:pPr>
       <w:r>
         <w:rPr>
@@ -3268,6 +3428,7 @@
       <w:pPr>
         <w:spacing w:after="80"/>
         <w:ind w:left="400" w:hanging="260"/>
+        <w:jc w:val="both"/>
       </w:pPr>
       <w:r>
         <w:rPr>
@@ -3292,6 +3453,7 @@
       <w:pPr>
         <w:spacing w:after="80"/>
         <w:ind w:left="400" w:hanging="260"/>
+        <w:jc w:val="both"/>
       </w:pPr>
       <w:r>
         <w:rPr>
@@ -3316,6 +3478,7 @@
       <w:pPr>
         <w:spacing w:after="80"/>
         <w:ind w:left="400" w:hanging="260"/>
+        <w:jc w:val="both"/>
       </w:pPr>
       <w:r>
         <w:rPr>
@@ -3340,6 +3503,7 @@
       <w:pPr>
         <w:spacing w:after="80"/>
         <w:ind w:left="400" w:hanging="260"/>
+        <w:jc w:val="both"/>
       </w:pPr>
       <w:r>
         <w:rPr>
@@ -3412,6 +3576,7 @@
     <w:p>
       <w:pPr>
         <w:spacing w:after="160"/>
+        <w:jc w:val="both"/>
       </w:pPr>
       <w:r>
         <w:rPr>
@@ -3427,7 +3592,18 @@
     </w:p>
     <w:p>
       <w:pPr>
-        <w:pageBreakBefore/>
+        <w:sectPr>
+          <w:footerReference w:type="default" r:id="rId13"/>
+          <w:type w:val="oddPage"/>
+          <w:pgSz w:w="8640" w:h="12960" w:orient="portrait"/>
+          <w:pgMar w:top="1152" w:right="1080" w:bottom="1080" w:left="1080" w:header="576" w:footer="576" w:gutter="0"/>
+          <w:pgNumType/>
+          <w:docGrid w:linePitch="360"/>
+        </w:sectPr>
+      </w:pPr>
+    </w:p>
+    <w:p>
+      <w:pPr>
         <w:spacing w:after="120" w:before="3720"/>
         <w:jc w:val="center"/>
       </w:pPr>
@@ -3508,6 +3684,7 @@
     <w:p>
       <w:pPr>
         <w:spacing w:after="160"/>
+        <w:jc w:val="both"/>
       </w:pPr>
       <w:r>
         <w:rPr>
@@ -3523,6 +3700,7 @@
       <w:pPr>
         <w:spacing w:after="60" w:before="200"/>
         <w:ind w:left="360" w:right="360"/>
+        <w:jc w:val="both"/>
       </w:pPr>
       <w:r>
         <w:rPr>
@@ -3556,6 +3734,7 @@
     <w:p>
       <w:pPr>
         <w:spacing w:after="160"/>
+        <w:jc w:val="both"/>
       </w:pPr>
       <w:r>
         <w:rPr>
@@ -3570,6 +3749,7 @@
     <w:p>
       <w:pPr>
         <w:spacing w:after="160"/>
+        <w:jc w:val="both"/>
       </w:pPr>
       <w:r>
         <w:rPr>
@@ -3585,6 +3765,7 @@
       <w:pPr>
         <w:spacing w:after="60" w:before="200"/>
         <w:ind w:left="360" w:right="360"/>
+        <w:jc w:val="both"/>
       </w:pPr>
       <w:r>
         <w:rPr>
@@ -3618,6 +3799,7 @@
     <w:p>
       <w:pPr>
         <w:spacing w:after="160"/>
+        <w:jc w:val="both"/>
       </w:pPr>
       <w:r>
         <w:rPr>
@@ -3632,6 +3814,7 @@
     <w:p>
       <w:pPr>
         <w:spacing w:after="160"/>
+        <w:jc w:val="both"/>
       </w:pPr>
       <w:r>
         <w:rPr>
@@ -3661,6 +3844,7 @@
     <w:p>
       <w:pPr>
         <w:spacing w:after="160"/>
+        <w:jc w:val="both"/>
       </w:pPr>
       <w:r>
         <w:rPr>
@@ -3676,6 +3860,7 @@
       <w:pPr>
         <w:spacing w:after="60" w:before="200"/>
         <w:ind w:left="360" w:right="360"/>
+        <w:jc w:val="both"/>
       </w:pPr>
       <w:r>
         <w:rPr>
@@ -3709,6 +3894,7 @@
     <w:p>
       <w:pPr>
         <w:spacing w:after="160"/>
+        <w:jc w:val="both"/>
       </w:pPr>
       <w:r>
         <w:rPr>
@@ -3723,6 +3909,7 @@
     <w:p>
       <w:pPr>
         <w:spacing w:after="160"/>
+        <w:jc w:val="both"/>
       </w:pPr>
       <w:r>
         <w:rPr>
@@ -3738,6 +3925,7 @@
       <w:pPr>
         <w:spacing w:after="60" w:before="200"/>
         <w:ind w:left="360" w:right="360"/>
+        <w:jc w:val="both"/>
       </w:pPr>
       <w:r>
         <w:rPr>
@@ -3771,6 +3959,7 @@
     <w:p>
       <w:pPr>
         <w:spacing w:after="160"/>
+        <w:jc w:val="both"/>
       </w:pPr>
       <w:r>
         <w:rPr>
@@ -3879,6 +4068,7 @@
       <w:pPr>
         <w:spacing w:after="80"/>
         <w:ind w:left="400" w:hanging="260"/>
+        <w:jc w:val="both"/>
       </w:pPr>
       <w:r>
         <w:rPr>
@@ -3903,6 +4093,7 @@
       <w:pPr>
         <w:spacing w:after="80"/>
         <w:ind w:left="400" w:hanging="260"/>
+        <w:jc w:val="both"/>
       </w:pPr>
       <w:r>
         <w:rPr>
@@ -3927,6 +4118,7 @@
       <w:pPr>
         <w:spacing w:after="80"/>
         <w:ind w:left="400" w:hanging="260"/>
+        <w:jc w:val="both"/>
       </w:pPr>
       <w:r>
         <w:rPr>
@@ -3951,6 +4143,7 @@
       <w:pPr>
         <w:spacing w:after="80"/>
         <w:ind w:left="400" w:hanging="260"/>
+        <w:jc w:val="both"/>
       </w:pPr>
       <w:r>
         <w:rPr>
@@ -4023,6 +4216,7 @@
     <w:p>
       <w:pPr>
         <w:spacing w:after="160"/>
+        <w:jc w:val="both"/>
       </w:pPr>
       <w:r>
         <w:rPr>
@@ -4038,7 +4232,18 @@
     </w:p>
     <w:p>
       <w:pPr>
-        <w:pageBreakBefore/>
+        <w:sectPr>
+          <w:footerReference w:type="default" r:id="rId14"/>
+          <w:type w:val="oddPage"/>
+          <w:pgSz w:w="8640" w:h="12960" w:orient="portrait"/>
+          <w:pgMar w:top="1152" w:right="1080" w:bottom="1080" w:left="1080" w:header="576" w:footer="576" w:gutter="0"/>
+          <w:pgNumType/>
+          <w:docGrid w:linePitch="360"/>
+        </w:sectPr>
+      </w:pPr>
+    </w:p>
+    <w:p>
+      <w:pPr>
         <w:spacing w:after="120" w:before="3720"/>
         <w:jc w:val="center"/>
       </w:pPr>
@@ -4119,6 +4324,7 @@
     <w:p>
       <w:pPr>
         <w:spacing w:after="160"/>
+        <w:jc w:val="both"/>
       </w:pPr>
       <w:r>
         <w:rPr>
@@ -4133,6 +4339,7 @@
     <w:p>
       <w:pPr>
         <w:spacing w:after="160"/>
+        <w:jc w:val="both"/>
       </w:pPr>
       <w:r>
         <w:rPr>
@@ -4148,6 +4355,7 @@
       <w:pPr>
         <w:spacing w:after="60" w:before="200"/>
         <w:ind w:left="360" w:right="360"/>
+        <w:jc w:val="both"/>
       </w:pPr>
       <w:r>
         <w:rPr>
@@ -4181,6 +4389,7 @@
     <w:p>
       <w:pPr>
         <w:spacing w:after="160"/>
+        <w:jc w:val="both"/>
       </w:pPr>
       <w:r>
         <w:rPr>
@@ -4195,6 +4404,7 @@
     <w:p>
       <w:pPr>
         <w:spacing w:after="160"/>
+        <w:jc w:val="both"/>
       </w:pPr>
       <w:r>
         <w:rPr>
@@ -4210,6 +4420,7 @@
       <w:pPr>
         <w:spacing w:after="60" w:before="200"/>
         <w:ind w:left="360" w:right="360"/>
+        <w:jc w:val="both"/>
       </w:pPr>
       <w:r>
         <w:rPr>
@@ -4243,6 +4454,7 @@
     <w:p>
       <w:pPr>
         <w:spacing w:after="160"/>
+        <w:jc w:val="both"/>
       </w:pPr>
       <w:r>
         <w:rPr>
@@ -4257,6 +4469,7 @@
     <w:p>
       <w:pPr>
         <w:spacing w:after="160"/>
+        <w:jc w:val="both"/>
       </w:pPr>
       <w:r>
         <w:rPr>
@@ -4286,6 +4499,7 @@
     <w:p>
       <w:pPr>
         <w:spacing w:after="160"/>
+        <w:jc w:val="both"/>
       </w:pPr>
       <w:r>
         <w:rPr>
@@ -4300,6 +4514,7 @@
     <w:p>
       <w:pPr>
         <w:spacing w:after="160"/>
+        <w:jc w:val="both"/>
       </w:pPr>
       <w:r>
         <w:rPr>
@@ -4314,6 +4529,7 @@
     <w:p>
       <w:pPr>
         <w:spacing w:after="160"/>
+        <w:jc w:val="both"/>
       </w:pPr>
       <w:r>
         <w:rPr>
@@ -4422,6 +4638,7 @@
       <w:pPr>
         <w:spacing w:after="80"/>
         <w:ind w:left="400" w:hanging="260"/>
+        <w:jc w:val="both"/>
       </w:pPr>
       <w:r>
         <w:rPr>
@@ -4446,6 +4663,7 @@
       <w:pPr>
         <w:spacing w:after="80"/>
         <w:ind w:left="400" w:hanging="260"/>
+        <w:jc w:val="both"/>
       </w:pPr>
       <w:r>
         <w:rPr>
@@ -4470,6 +4688,7 @@
       <w:pPr>
         <w:spacing w:after="80"/>
         <w:ind w:left="400" w:hanging="260"/>
+        <w:jc w:val="both"/>
       </w:pPr>
       <w:r>
         <w:rPr>
@@ -4494,6 +4713,7 @@
       <w:pPr>
         <w:spacing w:after="80"/>
         <w:ind w:left="400" w:hanging="260"/>
+        <w:jc w:val="both"/>
       </w:pPr>
       <w:r>
         <w:rPr>
@@ -4566,6 +4786,7 @@
     <w:p>
       <w:pPr>
         <w:spacing w:after="160"/>
+        <w:jc w:val="both"/>
       </w:pPr>
       <w:r>
         <w:rPr>
@@ -4581,7 +4802,18 @@
     </w:p>
     <w:p>
       <w:pPr>
-        <w:pageBreakBefore/>
+        <w:sectPr>
+          <w:footerReference w:type="default" r:id="rId15"/>
+          <w:type w:val="oddPage"/>
+          <w:pgSz w:w="8640" w:h="12960" w:orient="portrait"/>
+          <w:pgMar w:top="1152" w:right="1080" w:bottom="1080" w:left="1080" w:header="576" w:footer="576" w:gutter="0"/>
+          <w:pgNumType/>
+          <w:docGrid w:linePitch="360"/>
+        </w:sectPr>
+      </w:pPr>
+    </w:p>
+    <w:p>
+      <w:pPr>
         <w:spacing w:after="120" w:before="3720"/>
         <w:jc w:val="center"/>
       </w:pPr>
@@ -4662,6 +4894,7 @@
     <w:p>
       <w:pPr>
         <w:spacing w:after="160"/>
+        <w:jc w:val="both"/>
       </w:pPr>
       <w:r>
         <w:rPr>
@@ -4676,6 +4909,7 @@
     <w:p>
       <w:pPr>
         <w:spacing w:after="160"/>
+        <w:jc w:val="both"/>
       </w:pPr>
       <w:r>
         <w:rPr>
@@ -4691,6 +4925,7 @@
       <w:pPr>
         <w:spacing w:after="60" w:before="200"/>
         <w:ind w:left="360" w:right="360"/>
+        <w:jc w:val="both"/>
       </w:pPr>
       <w:r>
         <w:rPr>
@@ -4724,6 +4959,7 @@
     <w:p>
       <w:pPr>
         <w:spacing w:after="160"/>
+        <w:jc w:val="both"/>
       </w:pPr>
       <w:r>
         <w:rPr>
@@ -4738,6 +4974,7 @@
     <w:p>
       <w:pPr>
         <w:spacing w:after="160"/>
+        <w:jc w:val="both"/>
       </w:pPr>
       <w:r>
         <w:rPr>
@@ -4767,6 +5004,7 @@
     <w:p>
       <w:pPr>
         <w:spacing w:after="160"/>
+        <w:jc w:val="both"/>
       </w:pPr>
       <w:r>
         <w:rPr>
@@ -4781,6 +5019,7 @@
     <w:p>
       <w:pPr>
         <w:spacing w:after="160"/>
+        <w:jc w:val="both"/>
       </w:pPr>
       <w:r>
         <w:rPr>
@@ -4796,6 +5035,7 @@
       <w:pPr>
         <w:spacing w:after="60" w:before="200"/>
         <w:ind w:left="360" w:right="360"/>
+        <w:jc w:val="both"/>
       </w:pPr>
       <w:r>
         <w:rPr>
@@ -4829,6 +5069,7 @@
     <w:p>
       <w:pPr>
         <w:spacing w:after="160"/>
+        <w:jc w:val="both"/>
       </w:pPr>
       <w:r>
         <w:rPr>
@@ -4843,6 +5084,7 @@
     <w:p>
       <w:pPr>
         <w:spacing w:after="160"/>
+        <w:jc w:val="both"/>
       </w:pPr>
       <w:r>
         <w:rPr>
@@ -4872,6 +5114,7 @@
     <w:p>
       <w:pPr>
         <w:spacing w:after="160"/>
+        <w:jc w:val="both"/>
       </w:pPr>
       <w:r>
         <w:rPr>
@@ -4887,6 +5130,7 @@
       <w:pPr>
         <w:spacing w:after="60" w:before="200"/>
         <w:ind w:left="360" w:right="360"/>
+        <w:jc w:val="both"/>
       </w:pPr>
       <w:r>
         <w:rPr>
@@ -4920,6 +5164,7 @@
     <w:p>
       <w:pPr>
         <w:spacing w:after="160"/>
+        <w:jc w:val="both"/>
       </w:pPr>
       <w:r>
         <w:rPr>
@@ -4935,6 +5180,7 @@
       <w:pPr>
         <w:spacing w:after="60" w:before="200"/>
         <w:ind w:left="360" w:right="360"/>
+        <w:jc w:val="both"/>
       </w:pPr>
       <w:r>
         <w:rPr>
@@ -4968,6 +5214,7 @@
     <w:p>
       <w:pPr>
         <w:spacing w:after="160"/>
+        <w:jc w:val="both"/>
       </w:pPr>
       <w:r>
         <w:rPr>
@@ -5076,6 +5323,7 @@
       <w:pPr>
         <w:spacing w:after="80"/>
         <w:ind w:left="400" w:hanging="260"/>
+        <w:jc w:val="both"/>
       </w:pPr>
       <w:r>
         <w:rPr>
@@ -5100,6 +5348,7 @@
       <w:pPr>
         <w:spacing w:after="80"/>
         <w:ind w:left="400" w:hanging="260"/>
+        <w:jc w:val="both"/>
       </w:pPr>
       <w:r>
         <w:rPr>
@@ -5124,6 +5373,7 @@
       <w:pPr>
         <w:spacing w:after="80"/>
         <w:ind w:left="400" w:hanging="260"/>
+        <w:jc w:val="both"/>
       </w:pPr>
       <w:r>
         <w:rPr>
@@ -5148,6 +5398,7 @@
       <w:pPr>
         <w:spacing w:after="80"/>
         <w:ind w:left="400" w:hanging="260"/>
+        <w:jc w:val="both"/>
       </w:pPr>
       <w:r>
         <w:rPr>
@@ -5220,6 +5471,7 @@
     <w:p>
       <w:pPr>
         <w:spacing w:after="160"/>
+        <w:jc w:val="both"/>
       </w:pPr>
       <w:r>
         <w:rPr>
@@ -5235,7 +5487,18 @@
     </w:p>
     <w:p>
       <w:pPr>
-        <w:pageBreakBefore/>
+        <w:sectPr>
+          <w:footerReference w:type="default" r:id="rId16"/>
+          <w:type w:val="oddPage"/>
+          <w:pgSz w:w="8640" w:h="12960" w:orient="portrait"/>
+          <w:pgMar w:top="1152" w:right="1080" w:bottom="1080" w:left="1080" w:header="576" w:footer="576" w:gutter="0"/>
+          <w:pgNumType/>
+          <w:docGrid w:linePitch="360"/>
+        </w:sectPr>
+      </w:pPr>
+    </w:p>
+    <w:p>
+      <w:pPr>
         <w:spacing w:after="120" w:before="3720"/>
         <w:jc w:val="center"/>
       </w:pPr>
@@ -5316,6 +5579,7 @@
     <w:p>
       <w:pPr>
         <w:spacing w:after="160"/>
+        <w:jc w:val="both"/>
       </w:pPr>
       <w:r>
         <w:rPr>
@@ -5331,6 +5595,7 @@
       <w:pPr>
         <w:spacing w:after="60" w:before="200"/>
         <w:ind w:left="360" w:right="360"/>
+        <w:jc w:val="both"/>
       </w:pPr>
       <w:r>
         <w:rPr>
@@ -5364,6 +5629,7 @@
     <w:p>
       <w:pPr>
         <w:spacing w:after="160"/>
+        <w:jc w:val="both"/>
       </w:pPr>
       <w:r>
         <w:rPr>
@@ -5378,6 +5644,7 @@
     <w:p>
       <w:pPr>
         <w:spacing w:after="160"/>
+        <w:jc w:val="both"/>
       </w:pPr>
       <w:r>
         <w:rPr>
@@ -5407,6 +5674,7 @@
     <w:p>
       <w:pPr>
         <w:spacing w:after="160"/>
+        <w:jc w:val="both"/>
       </w:pPr>
       <w:r>
         <w:rPr>
@@ -5422,6 +5690,7 @@
       <w:pPr>
         <w:spacing w:after="60" w:before="200"/>
         <w:ind w:left="360" w:right="360"/>
+        <w:jc w:val="both"/>
       </w:pPr>
       <w:r>
         <w:rPr>
@@ -5455,6 +5724,7 @@
     <w:p>
       <w:pPr>
         <w:spacing w:after="160"/>
+        <w:jc w:val="both"/>
       </w:pPr>
       <w:r>
         <w:rPr>
@@ -5469,6 +5739,7 @@
     <w:p>
       <w:pPr>
         <w:spacing w:after="160"/>
+        <w:jc w:val="both"/>
       </w:pPr>
       <w:r>
         <w:rPr>
@@ -5483,6 +5754,7 @@
     <w:p>
       <w:pPr>
         <w:spacing w:after="160"/>
+        <w:jc w:val="both"/>
       </w:pPr>
       <w:r>
         <w:rPr>
@@ -5512,6 +5784,7 @@
     <w:p>
       <w:pPr>
         <w:spacing w:after="160"/>
+        <w:jc w:val="both"/>
       </w:pPr>
       <w:r>
         <w:rPr>
@@ -5526,6 +5799,7 @@
     <w:p>
       <w:pPr>
         <w:spacing w:after="160"/>
+        <w:jc w:val="both"/>
       </w:pPr>
       <w:r>
         <w:rPr>
@@ -5540,6 +5814,7 @@
     <w:p>
       <w:pPr>
         <w:spacing w:after="160"/>
+        <w:jc w:val="both"/>
       </w:pPr>
       <w:r>
         <w:rPr>
@@ -5554,6 +5829,7 @@
     <w:p>
       <w:pPr>
         <w:spacing w:after="160"/>
+        <w:jc w:val="both"/>
       </w:pPr>
       <w:r>
         <w:rPr>
@@ -5568,6 +5844,7 @@
     <w:p>
       <w:pPr>
         <w:spacing w:after="160"/>
+        <w:jc w:val="both"/>
       </w:pPr>
       <w:r>
         <w:rPr>
@@ -5597,6 +5874,7 @@
     <w:p>
       <w:pPr>
         <w:spacing w:after="160"/>
+        <w:jc w:val="both"/>
       </w:pPr>
       <w:r>
         <w:rPr>
@@ -5611,6 +5889,7 @@
     <w:p>
       <w:pPr>
         <w:spacing w:after="160"/>
+        <w:jc w:val="both"/>
       </w:pPr>
       <w:r>
         <w:rPr>
@@ -5626,6 +5905,7 @@
       <w:pPr>
         <w:spacing w:after="60" w:before="200"/>
         <w:ind w:left="360" w:right="360"/>
+        <w:jc w:val="both"/>
       </w:pPr>
       <w:r>
         <w:rPr>
@@ -5659,6 +5939,7 @@
     <w:p>
       <w:pPr>
         <w:spacing w:after="160"/>
+        <w:jc w:val="both"/>
       </w:pPr>
       <w:r>
         <w:rPr>
@@ -5673,6 +5954,7 @@
     <w:p>
       <w:pPr>
         <w:spacing w:after="160"/>
+        <w:jc w:val="both"/>
       </w:pPr>
       <w:r>
         <w:rPr>
@@ -5781,6 +6063,7 @@
       <w:pPr>
         <w:spacing w:after="80"/>
         <w:ind w:left="400" w:hanging="260"/>
+        <w:jc w:val="both"/>
       </w:pPr>
       <w:r>
         <w:rPr>
@@ -5805,6 +6088,7 @@
       <w:pPr>
         <w:spacing w:after="80"/>
         <w:ind w:left="400" w:hanging="260"/>
+        <w:jc w:val="both"/>
       </w:pPr>
       <w:r>
         <w:rPr>
@@ -5829,6 +6113,7 @@
       <w:pPr>
         <w:spacing w:after="80"/>
         <w:ind w:left="400" w:hanging="260"/>
+        <w:jc w:val="both"/>
       </w:pPr>
       <w:r>
         <w:rPr>
@@ -5853,6 +6138,7 @@
       <w:pPr>
         <w:spacing w:after="80"/>
         <w:ind w:left="400" w:hanging="260"/>
+        <w:jc w:val="both"/>
       </w:pPr>
       <w:r>
         <w:rPr>
@@ -5925,6 +6211,7 @@
     <w:p>
       <w:pPr>
         <w:spacing w:after="160"/>
+        <w:jc w:val="both"/>
       </w:pPr>
       <w:r>
         <w:rPr>
@@ -5940,7 +6227,18 @@
     </w:p>
     <w:p>
       <w:pPr>
-        <w:pageBreakBefore/>
+        <w:sectPr>
+          <w:footerReference w:type="default" r:id="rId17"/>
+          <w:type w:val="oddPage"/>
+          <w:pgSz w:w="8640" w:h="12960" w:orient="portrait"/>
+          <w:pgMar w:top="1152" w:right="1080" w:bottom="1080" w:left="1080" w:header="576" w:footer="576" w:gutter="0"/>
+          <w:pgNumType/>
+          <w:docGrid w:linePitch="360"/>
+        </w:sectPr>
+      </w:pPr>
+    </w:p>
+    <w:p>
+      <w:pPr>
         <w:spacing w:after="120" w:before="3720"/>
         <w:jc w:val="center"/>
       </w:pPr>
@@ -6021,6 +6319,7 @@
     <w:p>
       <w:pPr>
         <w:spacing w:after="160"/>
+        <w:jc w:val="both"/>
       </w:pPr>
       <w:r>
         <w:rPr>
@@ -6035,6 +6334,7 @@
     <w:p>
       <w:pPr>
         <w:spacing w:after="160"/>
+        <w:jc w:val="both"/>
       </w:pPr>
       <w:r>
         <w:rPr>
@@ -6049,6 +6349,7 @@
     <w:p>
       <w:pPr>
         <w:spacing w:after="160"/>
+        <w:jc w:val="both"/>
       </w:pPr>
       <w:r>
         <w:rPr>
@@ -6063,6 +6364,7 @@
     <w:p>
       <w:pPr>
         <w:spacing w:after="160"/>
+        <w:jc w:val="both"/>
       </w:pPr>
       <w:r>
         <w:rPr>
@@ -6092,6 +6394,7 @@
     <w:p>
       <w:pPr>
         <w:spacing w:after="160"/>
+        <w:jc w:val="both"/>
       </w:pPr>
       <w:r>
         <w:rPr>
@@ -6106,6 +6409,7 @@
     <w:p>
       <w:pPr>
         <w:spacing w:after="160"/>
+        <w:jc w:val="both"/>
       </w:pPr>
       <w:r>
         <w:rPr>
@@ -6120,6 +6424,7 @@
     <w:p>
       <w:pPr>
         <w:spacing w:after="160"/>
+        <w:jc w:val="both"/>
       </w:pPr>
       <w:r>
         <w:rPr>
@@ -6135,6 +6440,7 @@
       <w:pPr>
         <w:spacing w:after="60" w:before="200"/>
         <w:ind w:left="360" w:right="360"/>
+        <w:jc w:val="both"/>
       </w:pPr>
       <w:r>
         <w:rPr>
@@ -6168,6 +6474,7 @@
     <w:p>
       <w:pPr>
         <w:spacing w:after="160"/>
+        <w:jc w:val="both"/>
       </w:pPr>
       <w:r>
         <w:rPr>
@@ -6182,6 +6489,7 @@
     <w:p>
       <w:pPr>
         <w:spacing w:after="160"/>
+        <w:jc w:val="both"/>
       </w:pPr>
       <w:r>
         <w:rPr>
@@ -6211,6 +6519,7 @@
     <w:p>
       <w:pPr>
         <w:spacing w:after="160"/>
+        <w:jc w:val="both"/>
       </w:pPr>
       <w:r>
         <w:rPr>
@@ -6225,6 +6534,7 @@
     <w:p>
       <w:pPr>
         <w:spacing w:after="160"/>
+        <w:jc w:val="both"/>
       </w:pPr>
       <w:r>
         <w:rPr>
@@ -6239,6 +6549,7 @@
     <w:p>
       <w:pPr>
         <w:spacing w:after="160"/>
+        <w:jc w:val="both"/>
       </w:pPr>
       <w:r>
         <w:rPr>
@@ -6347,6 +6658,7 @@
       <w:pPr>
         <w:spacing w:after="80"/>
         <w:ind w:left="400" w:hanging="260"/>
+        <w:jc w:val="both"/>
       </w:pPr>
       <w:r>
         <w:rPr>
@@ -6371,6 +6683,7 @@
       <w:pPr>
         <w:spacing w:after="80"/>
         <w:ind w:left="400" w:hanging="260"/>
+        <w:jc w:val="both"/>
       </w:pPr>
       <w:r>
         <w:rPr>
@@ -6395,6 +6708,7 @@
       <w:pPr>
         <w:spacing w:after="80"/>
         <w:ind w:left="400" w:hanging="260"/>
+        <w:jc w:val="both"/>
       </w:pPr>
       <w:r>
         <w:rPr>
@@ -6419,6 +6733,7 @@
       <w:pPr>
         <w:spacing w:after="80"/>
         <w:ind w:left="400" w:hanging="260"/>
+        <w:jc w:val="both"/>
       </w:pPr>
       <w:r>
         <w:rPr>
@@ -6491,6 +6806,7 @@
     <w:p>
       <w:pPr>
         <w:spacing w:after="160"/>
+        <w:jc w:val="both"/>
       </w:pPr>
       <w:r>
         <w:rPr>
@@ -6506,7 +6822,18 @@
     </w:p>
     <w:p>
       <w:pPr>
-        <w:pageBreakBefore/>
+        <w:sectPr>
+          <w:footerReference w:type="default" r:id="rId18"/>
+          <w:type w:val="oddPage"/>
+          <w:pgSz w:w="8640" w:h="12960" w:orient="portrait"/>
+          <w:pgMar w:top="1152" w:right="1080" w:bottom="1080" w:left="1080" w:header="576" w:footer="576" w:gutter="0"/>
+          <w:pgNumType/>
+          <w:docGrid w:linePitch="360"/>
+        </w:sectPr>
+      </w:pPr>
+    </w:p>
+    <w:p>
+      <w:pPr>
         <w:spacing w:after="120" w:before="3720"/>
         <w:jc w:val="center"/>
       </w:pPr>
@@ -6587,6 +6914,7 @@
     <w:p>
       <w:pPr>
         <w:spacing w:after="160"/>
+        <w:jc w:val="both"/>
       </w:pPr>
       <w:r>
         <w:rPr>
@@ -6601,6 +6929,7 @@
     <w:p>
       <w:pPr>
         <w:spacing w:after="160"/>
+        <w:jc w:val="both"/>
       </w:pPr>
       <w:r>
         <w:rPr>
@@ -6615,6 +6944,7 @@
     <w:p>
       <w:pPr>
         <w:spacing w:after="160"/>
+        <w:jc w:val="both"/>
       </w:pPr>
       <w:r>
         <w:rPr>
@@ -6644,6 +6974,7 @@
     <w:p>
       <w:pPr>
         <w:spacing w:after="160"/>
+        <w:jc w:val="both"/>
       </w:pPr>
       <w:r>
         <w:rPr>
@@ -6658,6 +6989,7 @@
     <w:p>
       <w:pPr>
         <w:spacing w:after="160"/>
+        <w:jc w:val="both"/>
       </w:pPr>
       <w:r>
         <w:rPr>
@@ -6672,6 +7004,7 @@
     <w:p>
       <w:pPr>
         <w:spacing w:after="160"/>
+        <w:jc w:val="both"/>
       </w:pPr>
       <w:r>
         <w:rPr>
@@ -6686,6 +7019,7 @@
     <w:p>
       <w:pPr>
         <w:spacing w:after="160"/>
+        <w:jc w:val="both"/>
       </w:pPr>
       <w:r>
         <w:rPr>
@@ -6715,6 +7049,7 @@
     <w:p>
       <w:pPr>
         <w:spacing w:after="160"/>
+        <w:jc w:val="both"/>
       </w:pPr>
       <w:r>
         <w:rPr>
@@ -6729,6 +7064,7 @@
     <w:p>
       <w:pPr>
         <w:spacing w:after="160"/>
+        <w:jc w:val="both"/>
       </w:pPr>
       <w:r>
         <w:rPr>
@@ -6743,6 +7079,7 @@
     <w:p>
       <w:pPr>
         <w:spacing w:after="160"/>
+        <w:jc w:val="both"/>
       </w:pPr>
       <w:r>
         <w:rPr>
@@ -6851,6 +7188,7 @@
       <w:pPr>
         <w:spacing w:after="80"/>
         <w:ind w:left="400" w:hanging="260"/>
+        <w:jc w:val="both"/>
       </w:pPr>
       <w:r>
         <w:rPr>
@@ -6875,6 +7213,7 @@
       <w:pPr>
         <w:spacing w:after="80"/>
         <w:ind w:left="400" w:hanging="260"/>
+        <w:jc w:val="both"/>
       </w:pPr>
       <w:r>
         <w:rPr>
@@ -6899,6 +7238,7 @@
       <w:pPr>
         <w:spacing w:after="80"/>
         <w:ind w:left="400" w:hanging="260"/>
+        <w:jc w:val="both"/>
       </w:pPr>
       <w:r>
         <w:rPr>
@@ -6923,6 +7263,7 @@
       <w:pPr>
         <w:spacing w:after="80"/>
         <w:ind w:left="400" w:hanging="260"/>
+        <w:jc w:val="both"/>
       </w:pPr>
       <w:r>
         <w:rPr>
@@ -6995,6 +7336,7 @@
     <w:p>
       <w:pPr>
         <w:spacing w:after="160"/>
+        <w:jc w:val="both"/>
       </w:pPr>
       <w:r>
         <w:rPr>
@@ -7010,7 +7352,18 @@
     </w:p>
     <w:p>
       <w:pPr>
-        <w:pageBreakBefore/>
+        <w:sectPr>
+          <w:footerReference w:type="default" r:id="rId19"/>
+          <w:type w:val="oddPage"/>
+          <w:pgSz w:w="8640" w:h="12960" w:orient="portrait"/>
+          <w:pgMar w:top="1152" w:right="1080" w:bottom="1080" w:left="1080" w:header="576" w:footer="576" w:gutter="0"/>
+          <w:pgNumType/>
+          <w:docGrid w:linePitch="360"/>
+        </w:sectPr>
+      </w:pPr>
+    </w:p>
+    <w:p>
+      <w:pPr>
         <w:spacing w:after="120" w:before="3720"/>
         <w:jc w:val="center"/>
       </w:pPr>
@@ -7093,6 +7446,7 @@
     <w:p>
       <w:pPr>
         <w:spacing w:after="160"/>
+        <w:jc w:val="both"/>
       </w:pPr>
       <w:r>
         <w:rPr>
@@ -7107,6 +7461,7 @@
     <w:p>
       <w:pPr>
         <w:spacing w:after="160"/>
+        <w:jc w:val="both"/>
       </w:pPr>
       <w:r>
         <w:rPr>
@@ -7121,6 +7476,7 @@
     <w:p>
       <w:pPr>
         <w:spacing w:after="160"/>
+        <w:jc w:val="both"/>
       </w:pPr>
       <w:r>
         <w:rPr>
@@ -7135,6 +7491,7 @@
     <w:p>
       <w:pPr>
         <w:spacing w:after="160"/>
+        <w:jc w:val="both"/>
       </w:pPr>
       <w:r>
         <w:rPr>
@@ -7164,6 +7521,7 @@
     <w:p>
       <w:pPr>
         <w:spacing w:after="160"/>
+        <w:jc w:val="both"/>
       </w:pPr>
       <w:r>
         <w:rPr>
@@ -7178,6 +7536,7 @@
     <w:p>
       <w:pPr>
         <w:spacing w:after="160"/>
+        <w:jc w:val="both"/>
       </w:pPr>
       <w:r>
         <w:rPr>
@@ -7192,6 +7551,7 @@
     <w:p>
       <w:pPr>
         <w:spacing w:after="160"/>
+        <w:jc w:val="both"/>
       </w:pPr>
       <w:r>
         <w:rPr>
@@ -7221,6 +7581,7 @@
     <w:p>
       <w:pPr>
         <w:spacing w:after="160"/>
+        <w:jc w:val="both"/>
       </w:pPr>
       <w:r>
         <w:rPr>
@@ -7235,6 +7596,7 @@
     <w:p>
       <w:pPr>
         <w:spacing w:after="160"/>
+        <w:jc w:val="both"/>
       </w:pPr>
       <w:r>
         <w:rPr>
@@ -7249,6 +7611,7 @@
     <w:p>
       <w:pPr>
         <w:spacing w:after="160"/>
+        <w:jc w:val="both"/>
       </w:pPr>
       <w:r>
         <w:rPr>
@@ -7357,6 +7720,7 @@
       <w:pPr>
         <w:spacing w:after="80"/>
         <w:ind w:left="400" w:hanging="260"/>
+        <w:jc w:val="both"/>
       </w:pPr>
       <w:r>
         <w:rPr>
@@ -7381,6 +7745,7 @@
       <w:pPr>
         <w:spacing w:after="80"/>
         <w:ind w:left="400" w:hanging="260"/>
+        <w:jc w:val="both"/>
       </w:pPr>
       <w:r>
         <w:rPr>
@@ -7405,6 +7770,7 @@
       <w:pPr>
         <w:spacing w:after="80"/>
         <w:ind w:left="400" w:hanging="260"/>
+        <w:jc w:val="both"/>
       </w:pPr>
       <w:r>
         <w:rPr>
@@ -7429,6 +7795,7 @@
       <w:pPr>
         <w:spacing w:after="80"/>
         <w:ind w:left="400" w:hanging="260"/>
+        <w:jc w:val="both"/>
       </w:pPr>
       <w:r>
         <w:rPr>
@@ -7501,6 +7868,7 @@
     <w:p>
       <w:pPr>
         <w:spacing w:after="160"/>
+        <w:jc w:val="both"/>
       </w:pPr>
       <w:r>
         <w:rPr>
@@ -7516,7 +7884,18 @@
     </w:p>
     <w:p>
       <w:pPr>
-        <w:pageBreakBefore/>
+        <w:sectPr>
+          <w:footerReference w:type="default" r:id="rId20"/>
+          <w:type w:val="oddPage"/>
+          <w:pgSz w:w="8640" w:h="12960" w:orient="portrait"/>
+          <w:pgMar w:top="1152" w:right="1080" w:bottom="1080" w:left="1080" w:header="576" w:footer="576" w:gutter="0"/>
+          <w:pgNumType/>
+          <w:docGrid w:linePitch="360"/>
+        </w:sectPr>
+      </w:pPr>
+    </w:p>
+    <w:p>
+      <w:pPr>
         <w:spacing w:after="120" w:before="3720"/>
         <w:jc w:val="center"/>
       </w:pPr>
@@ -7599,6 +7978,7 @@
     <w:p>
       <w:pPr>
         <w:spacing w:after="160"/>
+        <w:jc w:val="both"/>
       </w:pPr>
       <w:r>
         <w:rPr>
@@ -7613,6 +7993,7 @@
     <w:p>
       <w:pPr>
         <w:spacing w:after="160"/>
+        <w:jc w:val="both"/>
       </w:pPr>
       <w:r>
         <w:rPr>
@@ -7627,6 +8008,7 @@
     <w:p>
       <w:pPr>
         <w:spacing w:after="160"/>
+        <w:jc w:val="both"/>
       </w:pPr>
       <w:r>
         <w:rPr>
@@ -7641,6 +8023,7 @@
     <w:p>
       <w:pPr>
         <w:spacing w:after="160"/>
+        <w:jc w:val="both"/>
       </w:pPr>
       <w:r>
         <w:rPr>
@@ -7656,6 +8039,7 @@
       <w:pPr>
         <w:spacing w:after="60" w:before="200"/>
         <w:ind w:left="360" w:right="360"/>
+        <w:jc w:val="both"/>
       </w:pPr>
       <w:r>
         <w:rPr>
@@ -7689,6 +8073,7 @@
     <w:p>
       <w:pPr>
         <w:spacing w:after="160"/>
+        <w:jc w:val="both"/>
       </w:pPr>
       <w:r>
         <w:rPr>
@@ -7703,6 +8088,7 @@
     <w:p>
       <w:pPr>
         <w:spacing w:after="160"/>
+        <w:jc w:val="both"/>
       </w:pPr>
       <w:r>
         <w:rPr>
@@ -7732,6 +8118,7 @@
     <w:p>
       <w:pPr>
         <w:spacing w:after="160"/>
+        <w:jc w:val="both"/>
       </w:pPr>
       <w:r>
         <w:rPr>
@@ -7746,6 +8133,7 @@
     <w:p>
       <w:pPr>
         <w:spacing w:after="160"/>
+        <w:jc w:val="both"/>
       </w:pPr>
       <w:r>
         <w:rPr>
@@ -7760,6 +8148,7 @@
     <w:p>
       <w:pPr>
         <w:spacing w:after="160"/>
+        <w:jc w:val="both"/>
       </w:pPr>
       <w:r>
         <w:rPr>
@@ -7774,6 +8163,7 @@
     <w:p>
       <w:pPr>
         <w:spacing w:after="160"/>
+        <w:jc w:val="both"/>
       </w:pPr>
       <w:r>
         <w:rPr>
@@ -7788,6 +8178,7 @@
     <w:p>
       <w:pPr>
         <w:spacing w:after="160"/>
+        <w:jc w:val="both"/>
       </w:pPr>
       <w:r>
         <w:rPr>
@@ -7817,6 +8208,7 @@
     <w:p>
       <w:pPr>
         <w:spacing w:after="160"/>
+        <w:jc w:val="both"/>
       </w:pPr>
       <w:r>
         <w:rPr>
@@ -7831,6 +8223,7 @@
     <w:p>
       <w:pPr>
         <w:spacing w:after="160"/>
+        <w:jc w:val="both"/>
       </w:pPr>
       <w:r>
         <w:rPr>
@@ -7845,6 +8238,7 @@
     <w:p>
       <w:pPr>
         <w:spacing w:after="160"/>
+        <w:jc w:val="both"/>
       </w:pPr>
       <w:r>
         <w:rPr>
@@ -7953,6 +8347,7 @@
       <w:pPr>
         <w:spacing w:after="80"/>
         <w:ind w:left="400" w:hanging="260"/>
+        <w:jc w:val="both"/>
       </w:pPr>
       <w:r>
         <w:rPr>
@@ -7977,6 +8372,7 @@
       <w:pPr>
         <w:spacing w:after="80"/>
         <w:ind w:left="400" w:hanging="260"/>
+        <w:jc w:val="both"/>
       </w:pPr>
       <w:r>
         <w:rPr>
@@ -8001,6 +8397,7 @@
       <w:pPr>
         <w:spacing w:after="80"/>
         <w:ind w:left="400" w:hanging="260"/>
+        <w:jc w:val="both"/>
       </w:pPr>
       <w:r>
         <w:rPr>
@@ -8025,6 +8422,7 @@
       <w:pPr>
         <w:spacing w:after="80"/>
         <w:ind w:left="400" w:hanging="260"/>
+        <w:jc w:val="both"/>
       </w:pPr>
       <w:r>
         <w:rPr>
@@ -8097,6 +8495,7 @@
     <w:p>
       <w:pPr>
         <w:spacing w:after="160"/>
+        <w:jc w:val="both"/>
       </w:pPr>
       <w:r>
         <w:rPr>
@@ -8112,7 +8511,18 @@
     </w:p>
     <w:p>
       <w:pPr>
-        <w:pageBreakBefore/>
+        <w:sectPr>
+          <w:footerReference w:type="default" r:id="rId21"/>
+          <w:type w:val="oddPage"/>
+          <w:pgSz w:w="8640" w:h="12960" w:orient="portrait"/>
+          <w:pgMar w:top="1152" w:right="1080" w:bottom="1080" w:left="1080" w:header="576" w:footer="576" w:gutter="0"/>
+          <w:pgNumType/>
+          <w:docGrid w:linePitch="360"/>
+        </w:sectPr>
+      </w:pPr>
+    </w:p>
+    <w:p>
+      <w:pPr>
         <w:spacing w:after="120" w:before="3720"/>
         <w:jc w:val="center"/>
       </w:pPr>
@@ -8193,6 +8603,7 @@
     <w:p>
       <w:pPr>
         <w:spacing w:after="160"/>
+        <w:jc w:val="both"/>
       </w:pPr>
       <w:r>
         <w:rPr>
@@ -8207,6 +8618,7 @@
     <w:p>
       <w:pPr>
         <w:spacing w:after="160"/>
+        <w:jc w:val="both"/>
       </w:pPr>
       <w:r>
         <w:rPr>
@@ -8222,6 +8634,7 @@
       <w:pPr>
         <w:spacing w:after="60" w:before="200"/>
         <w:ind w:left="360" w:right="360"/>
+        <w:jc w:val="both"/>
       </w:pPr>
       <w:r>
         <w:rPr>
@@ -8255,6 +8668,7 @@
     <w:p>
       <w:pPr>
         <w:spacing w:after="160"/>
+        <w:jc w:val="both"/>
       </w:pPr>
       <w:r>
         <w:rPr>
@@ -8269,6 +8683,7 @@
     <w:p>
       <w:pPr>
         <w:spacing w:after="160"/>
+        <w:jc w:val="both"/>
       </w:pPr>
       <w:r>
         <w:rPr>
@@ -8283,6 +8698,7 @@
     <w:p>
       <w:pPr>
         <w:spacing w:after="160"/>
+        <w:jc w:val="both"/>
       </w:pPr>
       <w:r>
         <w:rPr>
@@ -8297,6 +8713,7 @@
     <w:p>
       <w:pPr>
         <w:spacing w:after="160"/>
+        <w:jc w:val="both"/>
       </w:pPr>
       <w:r>
         <w:rPr>
@@ -8326,6 +8743,7 @@
     <w:p>
       <w:pPr>
         <w:spacing w:after="160"/>
+        <w:jc w:val="both"/>
       </w:pPr>
       <w:r>
         <w:rPr>
@@ -8341,6 +8759,7 @@
       <w:pPr>
         <w:spacing w:after="60" w:before="200"/>
         <w:ind w:left="360" w:right="360"/>
+        <w:jc w:val="both"/>
       </w:pPr>
       <w:r>
         <w:rPr>
@@ -8374,6 +8793,7 @@
     <w:p>
       <w:pPr>
         <w:spacing w:after="160"/>
+        <w:jc w:val="both"/>
       </w:pPr>
       <w:r>
         <w:rPr>
@@ -8388,6 +8808,7 @@
     <w:p>
       <w:pPr>
         <w:spacing w:after="160"/>
+        <w:jc w:val="both"/>
       </w:pPr>
       <w:r>
         <w:rPr>
@@ -8417,6 +8838,7 @@
     <w:p>
       <w:pPr>
         <w:spacing w:after="160"/>
+        <w:jc w:val="both"/>
       </w:pPr>
       <w:r>
         <w:rPr>
@@ -8431,6 +8853,7 @@
     <w:p>
       <w:pPr>
         <w:spacing w:after="160"/>
+        <w:jc w:val="both"/>
       </w:pPr>
       <w:r>
         <w:rPr>
@@ -8446,6 +8869,7 @@
       <w:pPr>
         <w:spacing w:after="60" w:before="200"/>
         <w:ind w:left="360" w:right="360"/>
+        <w:jc w:val="both"/>
       </w:pPr>
       <w:r>
         <w:rPr>
@@ -8479,6 +8903,7 @@
     <w:p>
       <w:pPr>
         <w:spacing w:after="160"/>
+        <w:jc w:val="both"/>
       </w:pPr>
       <w:r>
         <w:rPr>
@@ -8493,6 +8918,7 @@
     <w:p>
       <w:pPr>
         <w:spacing w:after="160"/>
+        <w:jc w:val="both"/>
       </w:pPr>
       <w:r>
         <w:rPr>
@@ -8507,6 +8933,7 @@
     <w:p>
       <w:pPr>
         <w:spacing w:after="160"/>
+        <w:jc w:val="both"/>
       </w:pPr>
       <w:r>
         <w:rPr>
@@ -8615,6 +9042,7 @@
       <w:pPr>
         <w:spacing w:after="80"/>
         <w:ind w:left="400" w:hanging="260"/>
+        <w:jc w:val="both"/>
       </w:pPr>
       <w:r>
         <w:rPr>
@@ -8639,6 +9067,7 @@
       <w:pPr>
         <w:spacing w:after="80"/>
         <w:ind w:left="400" w:hanging="260"/>
+        <w:jc w:val="both"/>
       </w:pPr>
       <w:r>
         <w:rPr>
@@ -8663,6 +9092,7 @@
       <w:pPr>
         <w:spacing w:after="80"/>
         <w:ind w:left="400" w:hanging="260"/>
+        <w:jc w:val="both"/>
       </w:pPr>
       <w:r>
         <w:rPr>
@@ -8687,6 +9117,7 @@
       <w:pPr>
         <w:spacing w:after="80"/>
         <w:ind w:left="400" w:hanging="260"/>
+        <w:jc w:val="both"/>
       </w:pPr>
       <w:r>
         <w:rPr>
@@ -8759,6 +9190,7 @@
     <w:p>
       <w:pPr>
         <w:spacing w:after="160"/>
+        <w:jc w:val="both"/>
       </w:pPr>
       <w:r>
         <w:rPr>
@@ -8774,7 +9206,18 @@
     </w:p>
     <w:p>
       <w:pPr>
-        <w:pageBreakBefore/>
+        <w:sectPr>
+          <w:footerReference w:type="default" r:id="rId22"/>
+          <w:type w:val="oddPage"/>
+          <w:pgSz w:w="8640" w:h="12960" w:orient="portrait"/>
+          <w:pgMar w:top="1152" w:right="1080" w:bottom="1080" w:left="1080" w:header="576" w:footer="576" w:gutter="0"/>
+          <w:pgNumType/>
+          <w:docGrid w:linePitch="360"/>
+        </w:sectPr>
+      </w:pPr>
+    </w:p>
+    <w:p>
+      <w:pPr>
         <w:spacing w:after="120" w:before="3720"/>
         <w:jc w:val="center"/>
       </w:pPr>
@@ -8855,6 +9298,7 @@
     <w:p>
       <w:pPr>
         <w:spacing w:after="160"/>
+        <w:jc w:val="both"/>
       </w:pPr>
       <w:r>
         <w:rPr>
@@ -8869,6 +9313,7 @@
     <w:p>
       <w:pPr>
         <w:spacing w:after="160"/>
+        <w:jc w:val="both"/>
       </w:pPr>
       <w:r>
         <w:rPr>
@@ -8884,6 +9329,7 @@
       <w:pPr>
         <w:spacing w:after="60" w:before="200"/>
         <w:ind w:left="360" w:right="360"/>
+        <w:jc w:val="both"/>
       </w:pPr>
       <w:r>
         <w:rPr>
@@ -8917,6 +9363,7 @@
     <w:p>
       <w:pPr>
         <w:spacing w:after="160"/>
+        <w:jc w:val="both"/>
       </w:pPr>
       <w:r>
         <w:rPr>
@@ -8931,6 +9378,7 @@
     <w:p>
       <w:pPr>
         <w:spacing w:after="160"/>
+        <w:jc w:val="both"/>
       </w:pPr>
       <w:r>
         <w:rPr>
@@ -8960,6 +9408,7 @@
     <w:p>
       <w:pPr>
         <w:spacing w:after="160"/>
+        <w:jc w:val="both"/>
       </w:pPr>
       <w:r>
         <w:rPr>
@@ -8974,6 +9423,7 @@
     <w:p>
       <w:pPr>
         <w:spacing w:after="160"/>
+        <w:jc w:val="both"/>
       </w:pPr>
       <w:r>
         <w:rPr>
@@ -8988,6 +9438,7 @@
     <w:p>
       <w:pPr>
         <w:spacing w:after="160"/>
+        <w:jc w:val="both"/>
       </w:pPr>
       <w:r>
         <w:rPr>
@@ -9002,6 +9453,7 @@
     <w:p>
       <w:pPr>
         <w:spacing w:after="160"/>
+        <w:jc w:val="both"/>
       </w:pPr>
       <w:r>
         <w:rPr>
@@ -9031,6 +9483,7 @@
     <w:p>
       <w:pPr>
         <w:spacing w:after="160"/>
+        <w:jc w:val="both"/>
       </w:pPr>
       <w:r>
         <w:rPr>
@@ -9045,6 +9498,7 @@
     <w:p>
       <w:pPr>
         <w:spacing w:after="160"/>
+        <w:jc w:val="both"/>
       </w:pPr>
       <w:r>
         <w:rPr>
@@ -9059,6 +9513,7 @@
     <w:p>
       <w:pPr>
         <w:spacing w:after="160"/>
+        <w:jc w:val="both"/>
       </w:pPr>
       <w:r>
         <w:rPr>
@@ -9073,6 +9528,7 @@
     <w:p>
       <w:pPr>
         <w:spacing w:after="160"/>
+        <w:jc w:val="both"/>
       </w:pPr>
       <w:r>
         <w:rPr>
@@ -9087,6 +9543,7 @@
     <w:p>
       <w:pPr>
         <w:spacing w:after="160"/>
+        <w:jc w:val="both"/>
       </w:pPr>
       <w:r>
         <w:rPr>
@@ -9195,6 +9652,7 @@
       <w:pPr>
         <w:spacing w:after="80"/>
         <w:ind w:left="400" w:hanging="260"/>
+        <w:jc w:val="both"/>
       </w:pPr>
       <w:r>
         <w:rPr>
@@ -9219,6 +9677,7 @@
       <w:pPr>
         <w:spacing w:after="80"/>
         <w:ind w:left="400" w:hanging="260"/>
+        <w:jc w:val="both"/>
       </w:pPr>
       <w:r>
         <w:rPr>
@@ -9243,6 +9702,7 @@
       <w:pPr>
         <w:spacing w:after="80"/>
         <w:ind w:left="400" w:hanging="260"/>
+        <w:jc w:val="both"/>
       </w:pPr>
       <w:r>
         <w:rPr>
@@ -9267,6 +9727,7 @@
       <w:pPr>
         <w:spacing w:after="80"/>
         <w:ind w:left="400" w:hanging="260"/>
+        <w:jc w:val="both"/>
       </w:pPr>
       <w:r>
         <w:rPr>
@@ -9339,6 +9800,7 @@
     <w:p>
       <w:pPr>
         <w:spacing w:after="160"/>
+        <w:jc w:val="both"/>
       </w:pPr>
       <w:r>
         <w:rPr>
@@ -9536,6 +9998,7 @@
     <w:p>
       <w:pPr>
         <w:spacing w:after="160"/>
+        <w:jc w:val="both"/>
       </w:pPr>
       <w:r>
         <w:rPr>
@@ -9552,6 +10015,7 @@
     <w:p>
       <w:pPr>
         <w:spacing w:after="160"/>
+        <w:jc w:val="both"/>
       </w:pPr>
       <w:r>
         <w:rPr>
@@ -9568,6 +10032,7 @@
     <w:p>
       <w:pPr>
         <w:spacing w:after="160"/>
+        <w:jc w:val="both"/>
       </w:pPr>
       <w:r>
         <w:rPr>
@@ -9584,6 +10049,7 @@
     <w:p>
       <w:pPr>
         <w:spacing w:after="160"/>
+        <w:jc w:val="both"/>
       </w:pPr>
       <w:r>
         <w:rPr>
@@ -9600,6 +10066,7 @@
     <w:p>
       <w:pPr>
         <w:spacing w:after="160"/>
+        <w:jc w:val="both"/>
       </w:pPr>
       <w:r>
         <w:rPr>
@@ -9616,6 +10083,7 @@
     <w:p>
       <w:pPr>
         <w:spacing w:after="160"/>
+        <w:jc w:val="both"/>
       </w:pPr>
       <w:r>
         <w:rPr>
@@ -9632,6 +10100,7 @@
     <w:p>
       <w:pPr>
         <w:spacing w:after="160"/>
+        <w:jc w:val="both"/>
       </w:pPr>
       <w:r>
         <w:rPr>
@@ -9662,7 +10131,18 @@
     </w:p>
     <w:p>
       <w:pPr>
-        <w:pageBreakBefore/>
+        <w:sectPr>
+          <w:footerReference w:type="default" r:id="rId23"/>
+          <w:type w:val="oddPage"/>
+          <w:pgSz w:w="8640" w:h="12960" w:orient="portrait"/>
+          <w:pgMar w:top="1152" w:right="1080" w:bottom="1080" w:left="1080" w:header="576" w:footer="576" w:gutter="0"/>
+          <w:pgNumType/>
+          <w:docGrid w:linePitch="360"/>
+        </w:sectPr>
+      </w:pPr>
+    </w:p>
+    <w:p>
+      <w:pPr>
         <w:spacing w:after="200" w:before="2000"/>
         <w:jc w:val="center"/>
       </w:pPr>
@@ -9747,7 +10227,8 @@
       </w:r>
     </w:p>
     <w:sectPr>
-      <w:footerReference w:type="default" r:id="rId7"/>
+      <w:footerReference w:type="default" r:id="rId24"/>
+      <w:type w:val="nextPage"/>
       <w:pgSz w:w="8640" w:h="12960" w:orient="portrait"/>
       <w:pgMar w:top="1152" w:right="1080" w:bottom="1080" w:left="1080" w:header="576" w:footer="576" w:gutter="0"/>
       <w:pgNumType/>
@@ -9799,6 +10280,380 @@
 </file>
 
 <file path=word/footer1.xml><?xml version="1.0" encoding="utf-8"?>
+<w:ftr xmlns:wpc="http://schemas.microsoft.com/office/word/2010/wordprocessingCanvas" xmlns:mc="http://schemas.openxmlformats.org/markup-compatibility/2006" xmlns:o="urn:schemas-microsoft-com:office:office" xmlns:r="http://schemas.openxmlformats.org/officeDocument/2006/relationships" xmlns:m="http://schemas.openxmlformats.org/officeDocument/2006/math" xmlns:v="urn:schemas-microsoft-com:vml" xmlns:wp14="http://schemas.microsoft.com/office/word/2010/wordprocessingDrawing" xmlns:wp="http://schemas.openxmlformats.org/drawingml/2006/wordprocessingDrawing" xmlns:w10="urn:schemas-microsoft-com:office:word" xmlns:w="http://schemas.openxmlformats.org/wordprocessingml/2006/main" xmlns:w14="http://schemas.microsoft.com/office/word/2010/wordml" xmlns:w15="http://schemas.microsoft.com/office/word/2012/wordml" xmlns:wpg="http://schemas.microsoft.com/office/word/2010/wordprocessingGroup" xmlns:wpi="http://schemas.microsoft.com/office/word/2010/wordprocessingInk" xmlns:wne="http://schemas.microsoft.com/office/word/2006/wordml" xmlns:wps="http://schemas.microsoft.com/office/word/2010/wordprocessingShape">
+  <w:p>
+    <w:pPr>
+      <w:jc w:val="center"/>
+    </w:pPr>
+    <w:r>
+      <w:rPr>
+        <w:rFonts w:ascii="Palatino Linotype" w:cs="Palatino Linotype" w:eastAsia="Palatino Linotype" w:hAnsi="Palatino Linotype"/>
+        <w:color w:val="000000"/>
+        <w:sz w:val="25"/>
+        <w:szCs w:val="25"/>
+      </w:rPr>
+      <w:fldChar w:fldCharType="begin"/>
+      <w:instrText xml:space="preserve">PAGE</w:instrText>
+      <w:fldChar w:fldCharType="separate"/>
+      <w:fldChar w:fldCharType="end"/>
+    </w:r>
+  </w:p>
+</w:ftr>
+</file>
+
+<file path=word/footer10.xml><?xml version="1.0" encoding="utf-8"?>
+<w:ftr xmlns:wpc="http://schemas.microsoft.com/office/word/2010/wordprocessingCanvas" xmlns:mc="http://schemas.openxmlformats.org/markup-compatibility/2006" xmlns:o="urn:schemas-microsoft-com:office:office" xmlns:r="http://schemas.openxmlformats.org/officeDocument/2006/relationships" xmlns:m="http://schemas.openxmlformats.org/officeDocument/2006/math" xmlns:v="urn:schemas-microsoft-com:vml" xmlns:wp14="http://schemas.microsoft.com/office/word/2010/wordprocessingDrawing" xmlns:wp="http://schemas.openxmlformats.org/drawingml/2006/wordprocessingDrawing" xmlns:w10="urn:schemas-microsoft-com:office:word" xmlns:w="http://schemas.openxmlformats.org/wordprocessingml/2006/main" xmlns:w14="http://schemas.microsoft.com/office/word/2010/wordml" xmlns:w15="http://schemas.microsoft.com/office/word/2012/wordml" xmlns:wpg="http://schemas.microsoft.com/office/word/2010/wordprocessingGroup" xmlns:wpi="http://schemas.microsoft.com/office/word/2010/wordprocessingInk" xmlns:wne="http://schemas.microsoft.com/office/word/2006/wordml" xmlns:wps="http://schemas.microsoft.com/office/word/2010/wordprocessingShape">
+  <w:p>
+    <w:pPr>
+      <w:jc w:val="center"/>
+    </w:pPr>
+    <w:r>
+      <w:rPr>
+        <w:rFonts w:ascii="Palatino Linotype" w:cs="Palatino Linotype" w:eastAsia="Palatino Linotype" w:hAnsi="Palatino Linotype"/>
+        <w:color w:val="000000"/>
+        <w:sz w:val="25"/>
+        <w:szCs w:val="25"/>
+      </w:rPr>
+      <w:fldChar w:fldCharType="begin"/>
+      <w:instrText xml:space="preserve">PAGE</w:instrText>
+      <w:fldChar w:fldCharType="separate"/>
+      <w:fldChar w:fldCharType="end"/>
+    </w:r>
+  </w:p>
+</w:ftr>
+</file>
+
+<file path=word/footer11.xml><?xml version="1.0" encoding="utf-8"?>
+<w:ftr xmlns:wpc="http://schemas.microsoft.com/office/word/2010/wordprocessingCanvas" xmlns:mc="http://schemas.openxmlformats.org/markup-compatibility/2006" xmlns:o="urn:schemas-microsoft-com:office:office" xmlns:r="http://schemas.openxmlformats.org/officeDocument/2006/relationships" xmlns:m="http://schemas.openxmlformats.org/officeDocument/2006/math" xmlns:v="urn:schemas-microsoft-com:vml" xmlns:wp14="http://schemas.microsoft.com/office/word/2010/wordprocessingDrawing" xmlns:wp="http://schemas.openxmlformats.org/drawingml/2006/wordprocessingDrawing" xmlns:w10="urn:schemas-microsoft-com:office:word" xmlns:w="http://schemas.openxmlformats.org/wordprocessingml/2006/main" xmlns:w14="http://schemas.microsoft.com/office/word/2010/wordml" xmlns:w15="http://schemas.microsoft.com/office/word/2012/wordml" xmlns:wpg="http://schemas.microsoft.com/office/word/2010/wordprocessingGroup" xmlns:wpi="http://schemas.microsoft.com/office/word/2010/wordprocessingInk" xmlns:wne="http://schemas.microsoft.com/office/word/2006/wordml" xmlns:wps="http://schemas.microsoft.com/office/word/2010/wordprocessingShape">
+  <w:p>
+    <w:pPr>
+      <w:jc w:val="center"/>
+    </w:pPr>
+    <w:r>
+      <w:rPr>
+        <w:rFonts w:ascii="Palatino Linotype" w:cs="Palatino Linotype" w:eastAsia="Palatino Linotype" w:hAnsi="Palatino Linotype"/>
+        <w:color w:val="000000"/>
+        <w:sz w:val="25"/>
+        <w:szCs w:val="25"/>
+      </w:rPr>
+      <w:fldChar w:fldCharType="begin"/>
+      <w:instrText xml:space="preserve">PAGE</w:instrText>
+      <w:fldChar w:fldCharType="separate"/>
+      <w:fldChar w:fldCharType="end"/>
+    </w:r>
+  </w:p>
+</w:ftr>
+</file>
+
+<file path=word/footer12.xml><?xml version="1.0" encoding="utf-8"?>
+<w:ftr xmlns:wpc="http://schemas.microsoft.com/office/word/2010/wordprocessingCanvas" xmlns:mc="http://schemas.openxmlformats.org/markup-compatibility/2006" xmlns:o="urn:schemas-microsoft-com:office:office" xmlns:r="http://schemas.openxmlformats.org/officeDocument/2006/relationships" xmlns:m="http://schemas.openxmlformats.org/officeDocument/2006/math" xmlns:v="urn:schemas-microsoft-com:vml" xmlns:wp14="http://schemas.microsoft.com/office/word/2010/wordprocessingDrawing" xmlns:wp="http://schemas.openxmlformats.org/drawingml/2006/wordprocessingDrawing" xmlns:w10="urn:schemas-microsoft-com:office:word" xmlns:w="http://schemas.openxmlformats.org/wordprocessingml/2006/main" xmlns:w14="http://schemas.microsoft.com/office/word/2010/wordml" xmlns:w15="http://schemas.microsoft.com/office/word/2012/wordml" xmlns:wpg="http://schemas.microsoft.com/office/word/2010/wordprocessingGroup" xmlns:wpi="http://schemas.microsoft.com/office/word/2010/wordprocessingInk" xmlns:wne="http://schemas.microsoft.com/office/word/2006/wordml" xmlns:wps="http://schemas.microsoft.com/office/word/2010/wordprocessingShape">
+  <w:p>
+    <w:pPr>
+      <w:jc w:val="center"/>
+    </w:pPr>
+    <w:r>
+      <w:rPr>
+        <w:rFonts w:ascii="Palatino Linotype" w:cs="Palatino Linotype" w:eastAsia="Palatino Linotype" w:hAnsi="Palatino Linotype"/>
+        <w:color w:val="000000"/>
+        <w:sz w:val="25"/>
+        <w:szCs w:val="25"/>
+      </w:rPr>
+      <w:fldChar w:fldCharType="begin"/>
+      <w:instrText xml:space="preserve">PAGE</w:instrText>
+      <w:fldChar w:fldCharType="separate"/>
+      <w:fldChar w:fldCharType="end"/>
+    </w:r>
+  </w:p>
+</w:ftr>
+</file>
+
+<file path=word/footer13.xml><?xml version="1.0" encoding="utf-8"?>
+<w:ftr xmlns:wpc="http://schemas.microsoft.com/office/word/2010/wordprocessingCanvas" xmlns:mc="http://schemas.openxmlformats.org/markup-compatibility/2006" xmlns:o="urn:schemas-microsoft-com:office:office" xmlns:r="http://schemas.openxmlformats.org/officeDocument/2006/relationships" xmlns:m="http://schemas.openxmlformats.org/officeDocument/2006/math" xmlns:v="urn:schemas-microsoft-com:vml" xmlns:wp14="http://schemas.microsoft.com/office/word/2010/wordprocessingDrawing" xmlns:wp="http://schemas.openxmlformats.org/drawingml/2006/wordprocessingDrawing" xmlns:w10="urn:schemas-microsoft-com:office:word" xmlns:w="http://schemas.openxmlformats.org/wordprocessingml/2006/main" xmlns:w14="http://schemas.microsoft.com/office/word/2010/wordml" xmlns:w15="http://schemas.microsoft.com/office/word/2012/wordml" xmlns:wpg="http://schemas.microsoft.com/office/word/2010/wordprocessingGroup" xmlns:wpi="http://schemas.microsoft.com/office/word/2010/wordprocessingInk" xmlns:wne="http://schemas.microsoft.com/office/word/2006/wordml" xmlns:wps="http://schemas.microsoft.com/office/word/2010/wordprocessingShape">
+  <w:p>
+    <w:pPr>
+      <w:jc w:val="center"/>
+    </w:pPr>
+    <w:r>
+      <w:rPr>
+        <w:rFonts w:ascii="Palatino Linotype" w:cs="Palatino Linotype" w:eastAsia="Palatino Linotype" w:hAnsi="Palatino Linotype"/>
+        <w:color w:val="000000"/>
+        <w:sz w:val="25"/>
+        <w:szCs w:val="25"/>
+      </w:rPr>
+      <w:fldChar w:fldCharType="begin"/>
+      <w:instrText xml:space="preserve">PAGE</w:instrText>
+      <w:fldChar w:fldCharType="separate"/>
+      <w:fldChar w:fldCharType="end"/>
+    </w:r>
+  </w:p>
+</w:ftr>
+</file>
+
+<file path=word/footer14.xml><?xml version="1.0" encoding="utf-8"?>
+<w:ftr xmlns:wpc="http://schemas.microsoft.com/office/word/2010/wordprocessingCanvas" xmlns:mc="http://schemas.openxmlformats.org/markup-compatibility/2006" xmlns:o="urn:schemas-microsoft-com:office:office" xmlns:r="http://schemas.openxmlformats.org/officeDocument/2006/relationships" xmlns:m="http://schemas.openxmlformats.org/officeDocument/2006/math" xmlns:v="urn:schemas-microsoft-com:vml" xmlns:wp14="http://schemas.microsoft.com/office/word/2010/wordprocessingDrawing" xmlns:wp="http://schemas.openxmlformats.org/drawingml/2006/wordprocessingDrawing" xmlns:w10="urn:schemas-microsoft-com:office:word" xmlns:w="http://schemas.openxmlformats.org/wordprocessingml/2006/main" xmlns:w14="http://schemas.microsoft.com/office/word/2010/wordml" xmlns:w15="http://schemas.microsoft.com/office/word/2012/wordml" xmlns:wpg="http://schemas.microsoft.com/office/word/2010/wordprocessingGroup" xmlns:wpi="http://schemas.microsoft.com/office/word/2010/wordprocessingInk" xmlns:wne="http://schemas.microsoft.com/office/word/2006/wordml" xmlns:wps="http://schemas.microsoft.com/office/word/2010/wordprocessingShape">
+  <w:p>
+    <w:pPr>
+      <w:jc w:val="center"/>
+    </w:pPr>
+    <w:r>
+      <w:rPr>
+        <w:rFonts w:ascii="Palatino Linotype" w:cs="Palatino Linotype" w:eastAsia="Palatino Linotype" w:hAnsi="Palatino Linotype"/>
+        <w:color w:val="000000"/>
+        <w:sz w:val="25"/>
+        <w:szCs w:val="25"/>
+      </w:rPr>
+      <w:fldChar w:fldCharType="begin"/>
+      <w:instrText xml:space="preserve">PAGE</w:instrText>
+      <w:fldChar w:fldCharType="separate"/>
+      <w:fldChar w:fldCharType="end"/>
+    </w:r>
+  </w:p>
+</w:ftr>
+</file>
+
+<file path=word/footer15.xml><?xml version="1.0" encoding="utf-8"?>
+<w:ftr xmlns:wpc="http://schemas.microsoft.com/office/word/2010/wordprocessingCanvas" xmlns:mc="http://schemas.openxmlformats.org/markup-compatibility/2006" xmlns:o="urn:schemas-microsoft-com:office:office" xmlns:r="http://schemas.openxmlformats.org/officeDocument/2006/relationships" xmlns:m="http://schemas.openxmlformats.org/officeDocument/2006/math" xmlns:v="urn:schemas-microsoft-com:vml" xmlns:wp14="http://schemas.microsoft.com/office/word/2010/wordprocessingDrawing" xmlns:wp="http://schemas.openxmlformats.org/drawingml/2006/wordprocessingDrawing" xmlns:w10="urn:schemas-microsoft-com:office:word" xmlns:w="http://schemas.openxmlformats.org/wordprocessingml/2006/main" xmlns:w14="http://schemas.microsoft.com/office/word/2010/wordml" xmlns:w15="http://schemas.microsoft.com/office/word/2012/wordml" xmlns:wpg="http://schemas.microsoft.com/office/word/2010/wordprocessingGroup" xmlns:wpi="http://schemas.microsoft.com/office/word/2010/wordprocessingInk" xmlns:wne="http://schemas.microsoft.com/office/word/2006/wordml" xmlns:wps="http://schemas.microsoft.com/office/word/2010/wordprocessingShape">
+  <w:p>
+    <w:pPr>
+      <w:jc w:val="center"/>
+    </w:pPr>
+    <w:r>
+      <w:rPr>
+        <w:rFonts w:ascii="Palatino Linotype" w:cs="Palatino Linotype" w:eastAsia="Palatino Linotype" w:hAnsi="Palatino Linotype"/>
+        <w:color w:val="000000"/>
+        <w:sz w:val="25"/>
+        <w:szCs w:val="25"/>
+      </w:rPr>
+      <w:fldChar w:fldCharType="begin"/>
+      <w:instrText xml:space="preserve">PAGE</w:instrText>
+      <w:fldChar w:fldCharType="separate"/>
+      <w:fldChar w:fldCharType="end"/>
+    </w:r>
+  </w:p>
+</w:ftr>
+</file>
+
+<file path=word/footer16.xml><?xml version="1.0" encoding="utf-8"?>
+<w:ftr xmlns:wpc="http://schemas.microsoft.com/office/word/2010/wordprocessingCanvas" xmlns:mc="http://schemas.openxmlformats.org/markup-compatibility/2006" xmlns:o="urn:schemas-microsoft-com:office:office" xmlns:r="http://schemas.openxmlformats.org/officeDocument/2006/relationships" xmlns:m="http://schemas.openxmlformats.org/officeDocument/2006/math" xmlns:v="urn:schemas-microsoft-com:vml" xmlns:wp14="http://schemas.microsoft.com/office/word/2010/wordprocessingDrawing" xmlns:wp="http://schemas.openxmlformats.org/drawingml/2006/wordprocessingDrawing" xmlns:w10="urn:schemas-microsoft-com:office:word" xmlns:w="http://schemas.openxmlformats.org/wordprocessingml/2006/main" xmlns:w14="http://schemas.microsoft.com/office/word/2010/wordml" xmlns:w15="http://schemas.microsoft.com/office/word/2012/wordml" xmlns:wpg="http://schemas.microsoft.com/office/word/2010/wordprocessingGroup" xmlns:wpi="http://schemas.microsoft.com/office/word/2010/wordprocessingInk" xmlns:wne="http://schemas.microsoft.com/office/word/2006/wordml" xmlns:wps="http://schemas.microsoft.com/office/word/2010/wordprocessingShape">
+  <w:p>
+    <w:pPr>
+      <w:jc w:val="center"/>
+    </w:pPr>
+    <w:r>
+      <w:rPr>
+        <w:rFonts w:ascii="Palatino Linotype" w:cs="Palatino Linotype" w:eastAsia="Palatino Linotype" w:hAnsi="Palatino Linotype"/>
+        <w:color w:val="000000"/>
+        <w:sz w:val="25"/>
+        <w:szCs w:val="25"/>
+      </w:rPr>
+      <w:fldChar w:fldCharType="begin"/>
+      <w:instrText xml:space="preserve">PAGE</w:instrText>
+      <w:fldChar w:fldCharType="separate"/>
+      <w:fldChar w:fldCharType="end"/>
+    </w:r>
+  </w:p>
+</w:ftr>
+</file>
+
+<file path=word/footer17.xml><?xml version="1.0" encoding="utf-8"?>
+<w:ftr xmlns:wpc="http://schemas.microsoft.com/office/word/2010/wordprocessingCanvas" xmlns:mc="http://schemas.openxmlformats.org/markup-compatibility/2006" xmlns:o="urn:schemas-microsoft-com:office:office" xmlns:r="http://schemas.openxmlformats.org/officeDocument/2006/relationships" xmlns:m="http://schemas.openxmlformats.org/officeDocument/2006/math" xmlns:v="urn:schemas-microsoft-com:vml" xmlns:wp14="http://schemas.microsoft.com/office/word/2010/wordprocessingDrawing" xmlns:wp="http://schemas.openxmlformats.org/drawingml/2006/wordprocessingDrawing" xmlns:w10="urn:schemas-microsoft-com:office:word" xmlns:w="http://schemas.openxmlformats.org/wordprocessingml/2006/main" xmlns:w14="http://schemas.microsoft.com/office/word/2010/wordml" xmlns:w15="http://schemas.microsoft.com/office/word/2012/wordml" xmlns:wpg="http://schemas.microsoft.com/office/word/2010/wordprocessingGroup" xmlns:wpi="http://schemas.microsoft.com/office/word/2010/wordprocessingInk" xmlns:wne="http://schemas.microsoft.com/office/word/2006/wordml" xmlns:wps="http://schemas.microsoft.com/office/word/2010/wordprocessingShape">
+  <w:p>
+    <w:pPr>
+      <w:jc w:val="center"/>
+    </w:pPr>
+    <w:r>
+      <w:rPr>
+        <w:rFonts w:ascii="Palatino Linotype" w:cs="Palatino Linotype" w:eastAsia="Palatino Linotype" w:hAnsi="Palatino Linotype"/>
+        <w:color w:val="000000"/>
+        <w:sz w:val="25"/>
+        <w:szCs w:val="25"/>
+      </w:rPr>
+      <w:fldChar w:fldCharType="begin"/>
+      <w:instrText xml:space="preserve">PAGE</w:instrText>
+      <w:fldChar w:fldCharType="separate"/>
+      <w:fldChar w:fldCharType="end"/>
+    </w:r>
+  </w:p>
+</w:ftr>
+</file>
+
+<file path=word/footer18.xml><?xml version="1.0" encoding="utf-8"?>
+<w:ftr xmlns:wpc="http://schemas.microsoft.com/office/word/2010/wordprocessingCanvas" xmlns:mc="http://schemas.openxmlformats.org/markup-compatibility/2006" xmlns:o="urn:schemas-microsoft-com:office:office" xmlns:r="http://schemas.openxmlformats.org/officeDocument/2006/relationships" xmlns:m="http://schemas.openxmlformats.org/officeDocument/2006/math" xmlns:v="urn:schemas-microsoft-com:vml" xmlns:wp14="http://schemas.microsoft.com/office/word/2010/wordprocessingDrawing" xmlns:wp="http://schemas.openxmlformats.org/drawingml/2006/wordprocessingDrawing" xmlns:w10="urn:schemas-microsoft-com:office:word" xmlns:w="http://schemas.openxmlformats.org/wordprocessingml/2006/main" xmlns:w14="http://schemas.microsoft.com/office/word/2010/wordml" xmlns:w15="http://schemas.microsoft.com/office/word/2012/wordml" xmlns:wpg="http://schemas.microsoft.com/office/word/2010/wordprocessingGroup" xmlns:wpi="http://schemas.microsoft.com/office/word/2010/wordprocessingInk" xmlns:wne="http://schemas.microsoft.com/office/word/2006/wordml" xmlns:wps="http://schemas.microsoft.com/office/word/2010/wordprocessingShape">
+  <w:p>
+    <w:pPr>
+      <w:jc w:val="center"/>
+    </w:pPr>
+    <w:r>
+      <w:rPr>
+        <w:rFonts w:ascii="Palatino Linotype" w:cs="Palatino Linotype" w:eastAsia="Palatino Linotype" w:hAnsi="Palatino Linotype"/>
+        <w:color w:val="000000"/>
+        <w:sz w:val="25"/>
+        <w:szCs w:val="25"/>
+      </w:rPr>
+      <w:fldChar w:fldCharType="begin"/>
+      <w:instrText xml:space="preserve">PAGE</w:instrText>
+      <w:fldChar w:fldCharType="separate"/>
+      <w:fldChar w:fldCharType="end"/>
+    </w:r>
+  </w:p>
+</w:ftr>
+</file>
+
+<file path=word/footer2.xml><?xml version="1.0" encoding="utf-8"?>
+<w:ftr xmlns:wpc="http://schemas.microsoft.com/office/word/2010/wordprocessingCanvas" xmlns:mc="http://schemas.openxmlformats.org/markup-compatibility/2006" xmlns:o="urn:schemas-microsoft-com:office:office" xmlns:r="http://schemas.openxmlformats.org/officeDocument/2006/relationships" xmlns:m="http://schemas.openxmlformats.org/officeDocument/2006/math" xmlns:v="urn:schemas-microsoft-com:vml" xmlns:wp14="http://schemas.microsoft.com/office/word/2010/wordprocessingDrawing" xmlns:wp="http://schemas.openxmlformats.org/drawingml/2006/wordprocessingDrawing" xmlns:w10="urn:schemas-microsoft-com:office:word" xmlns:w="http://schemas.openxmlformats.org/wordprocessingml/2006/main" xmlns:w14="http://schemas.microsoft.com/office/word/2010/wordml" xmlns:w15="http://schemas.microsoft.com/office/word/2012/wordml" xmlns:wpg="http://schemas.microsoft.com/office/word/2010/wordprocessingGroup" xmlns:wpi="http://schemas.microsoft.com/office/word/2010/wordprocessingInk" xmlns:wne="http://schemas.microsoft.com/office/word/2006/wordml" xmlns:wps="http://schemas.microsoft.com/office/word/2010/wordprocessingShape">
+  <w:p>
+    <w:pPr>
+      <w:jc w:val="center"/>
+    </w:pPr>
+    <w:r>
+      <w:rPr>
+        <w:rFonts w:ascii="Palatino Linotype" w:cs="Palatino Linotype" w:eastAsia="Palatino Linotype" w:hAnsi="Palatino Linotype"/>
+        <w:color w:val="000000"/>
+        <w:sz w:val="25"/>
+        <w:szCs w:val="25"/>
+      </w:rPr>
+      <w:fldChar w:fldCharType="begin"/>
+      <w:instrText xml:space="preserve">PAGE</w:instrText>
+      <w:fldChar w:fldCharType="separate"/>
+      <w:fldChar w:fldCharType="end"/>
+    </w:r>
+  </w:p>
+</w:ftr>
+</file>
+
+<file path=word/footer3.xml><?xml version="1.0" encoding="utf-8"?>
+<w:ftr xmlns:wpc="http://schemas.microsoft.com/office/word/2010/wordprocessingCanvas" xmlns:mc="http://schemas.openxmlformats.org/markup-compatibility/2006" xmlns:o="urn:schemas-microsoft-com:office:office" xmlns:r="http://schemas.openxmlformats.org/officeDocument/2006/relationships" xmlns:m="http://schemas.openxmlformats.org/officeDocument/2006/math" xmlns:v="urn:schemas-microsoft-com:vml" xmlns:wp14="http://schemas.microsoft.com/office/word/2010/wordprocessingDrawing" xmlns:wp="http://schemas.openxmlformats.org/drawingml/2006/wordprocessingDrawing" xmlns:w10="urn:schemas-microsoft-com:office:word" xmlns:w="http://schemas.openxmlformats.org/wordprocessingml/2006/main" xmlns:w14="http://schemas.microsoft.com/office/word/2010/wordml" xmlns:w15="http://schemas.microsoft.com/office/word/2012/wordml" xmlns:wpg="http://schemas.microsoft.com/office/word/2010/wordprocessingGroup" xmlns:wpi="http://schemas.microsoft.com/office/word/2010/wordprocessingInk" xmlns:wne="http://schemas.microsoft.com/office/word/2006/wordml" xmlns:wps="http://schemas.microsoft.com/office/word/2010/wordprocessingShape">
+  <w:p>
+    <w:pPr>
+      <w:jc w:val="center"/>
+    </w:pPr>
+    <w:r>
+      <w:rPr>
+        <w:rFonts w:ascii="Palatino Linotype" w:cs="Palatino Linotype" w:eastAsia="Palatino Linotype" w:hAnsi="Palatino Linotype"/>
+        <w:color w:val="000000"/>
+        <w:sz w:val="25"/>
+        <w:szCs w:val="25"/>
+      </w:rPr>
+      <w:fldChar w:fldCharType="begin"/>
+      <w:instrText xml:space="preserve">PAGE</w:instrText>
+      <w:fldChar w:fldCharType="separate"/>
+      <w:fldChar w:fldCharType="end"/>
+    </w:r>
+  </w:p>
+</w:ftr>
+</file>
+
+<file path=word/footer4.xml><?xml version="1.0" encoding="utf-8"?>
+<w:ftr xmlns:wpc="http://schemas.microsoft.com/office/word/2010/wordprocessingCanvas" xmlns:mc="http://schemas.openxmlformats.org/markup-compatibility/2006" xmlns:o="urn:schemas-microsoft-com:office:office" xmlns:r="http://schemas.openxmlformats.org/officeDocument/2006/relationships" xmlns:m="http://schemas.openxmlformats.org/officeDocument/2006/math" xmlns:v="urn:schemas-microsoft-com:vml" xmlns:wp14="http://schemas.microsoft.com/office/word/2010/wordprocessingDrawing" xmlns:wp="http://schemas.openxmlformats.org/drawingml/2006/wordprocessingDrawing" xmlns:w10="urn:schemas-microsoft-com:office:word" xmlns:w="http://schemas.openxmlformats.org/wordprocessingml/2006/main" xmlns:w14="http://schemas.microsoft.com/office/word/2010/wordml" xmlns:w15="http://schemas.microsoft.com/office/word/2012/wordml" xmlns:wpg="http://schemas.microsoft.com/office/word/2010/wordprocessingGroup" xmlns:wpi="http://schemas.microsoft.com/office/word/2010/wordprocessingInk" xmlns:wne="http://schemas.microsoft.com/office/word/2006/wordml" xmlns:wps="http://schemas.microsoft.com/office/word/2010/wordprocessingShape">
+  <w:p>
+    <w:pPr>
+      <w:jc w:val="center"/>
+    </w:pPr>
+    <w:r>
+      <w:rPr>
+        <w:rFonts w:ascii="Palatino Linotype" w:cs="Palatino Linotype" w:eastAsia="Palatino Linotype" w:hAnsi="Palatino Linotype"/>
+        <w:color w:val="000000"/>
+        <w:sz w:val="25"/>
+        <w:szCs w:val="25"/>
+      </w:rPr>
+      <w:fldChar w:fldCharType="begin"/>
+      <w:instrText xml:space="preserve">PAGE</w:instrText>
+      <w:fldChar w:fldCharType="separate"/>
+      <w:fldChar w:fldCharType="end"/>
+    </w:r>
+  </w:p>
+</w:ftr>
+</file>
+
+<file path=word/footer5.xml><?xml version="1.0" encoding="utf-8"?>
+<w:ftr xmlns:wpc="http://schemas.microsoft.com/office/word/2010/wordprocessingCanvas" xmlns:mc="http://schemas.openxmlformats.org/markup-compatibility/2006" xmlns:o="urn:schemas-microsoft-com:office:office" xmlns:r="http://schemas.openxmlformats.org/officeDocument/2006/relationships" xmlns:m="http://schemas.openxmlformats.org/officeDocument/2006/math" xmlns:v="urn:schemas-microsoft-com:vml" xmlns:wp14="http://schemas.microsoft.com/office/word/2010/wordprocessingDrawing" xmlns:wp="http://schemas.openxmlformats.org/drawingml/2006/wordprocessingDrawing" xmlns:w10="urn:schemas-microsoft-com:office:word" xmlns:w="http://schemas.openxmlformats.org/wordprocessingml/2006/main" xmlns:w14="http://schemas.microsoft.com/office/word/2010/wordml" xmlns:w15="http://schemas.microsoft.com/office/word/2012/wordml" xmlns:wpg="http://schemas.microsoft.com/office/word/2010/wordprocessingGroup" xmlns:wpi="http://schemas.microsoft.com/office/word/2010/wordprocessingInk" xmlns:wne="http://schemas.microsoft.com/office/word/2006/wordml" xmlns:wps="http://schemas.microsoft.com/office/word/2010/wordprocessingShape">
+  <w:p>
+    <w:pPr>
+      <w:jc w:val="center"/>
+    </w:pPr>
+    <w:r>
+      <w:rPr>
+        <w:rFonts w:ascii="Palatino Linotype" w:cs="Palatino Linotype" w:eastAsia="Palatino Linotype" w:hAnsi="Palatino Linotype"/>
+        <w:color w:val="000000"/>
+        <w:sz w:val="25"/>
+        <w:szCs w:val="25"/>
+      </w:rPr>
+      <w:fldChar w:fldCharType="begin"/>
+      <w:instrText xml:space="preserve">PAGE</w:instrText>
+      <w:fldChar w:fldCharType="separate"/>
+      <w:fldChar w:fldCharType="end"/>
+    </w:r>
+  </w:p>
+</w:ftr>
+</file>
+
+<file path=word/footer6.xml><?xml version="1.0" encoding="utf-8"?>
+<w:ftr xmlns:wpc="http://schemas.microsoft.com/office/word/2010/wordprocessingCanvas" xmlns:mc="http://schemas.openxmlformats.org/markup-compatibility/2006" xmlns:o="urn:schemas-microsoft-com:office:office" xmlns:r="http://schemas.openxmlformats.org/officeDocument/2006/relationships" xmlns:m="http://schemas.openxmlformats.org/officeDocument/2006/math" xmlns:v="urn:schemas-microsoft-com:vml" xmlns:wp14="http://schemas.microsoft.com/office/word/2010/wordprocessingDrawing" xmlns:wp="http://schemas.openxmlformats.org/drawingml/2006/wordprocessingDrawing" xmlns:w10="urn:schemas-microsoft-com:office:word" xmlns:w="http://schemas.openxmlformats.org/wordprocessingml/2006/main" xmlns:w14="http://schemas.microsoft.com/office/word/2010/wordml" xmlns:w15="http://schemas.microsoft.com/office/word/2012/wordml" xmlns:wpg="http://schemas.microsoft.com/office/word/2010/wordprocessingGroup" xmlns:wpi="http://schemas.microsoft.com/office/word/2010/wordprocessingInk" xmlns:wne="http://schemas.microsoft.com/office/word/2006/wordml" xmlns:wps="http://schemas.microsoft.com/office/word/2010/wordprocessingShape">
+  <w:p>
+    <w:pPr>
+      <w:jc w:val="center"/>
+    </w:pPr>
+    <w:r>
+      <w:rPr>
+        <w:rFonts w:ascii="Palatino Linotype" w:cs="Palatino Linotype" w:eastAsia="Palatino Linotype" w:hAnsi="Palatino Linotype"/>
+        <w:color w:val="000000"/>
+        <w:sz w:val="25"/>
+        <w:szCs w:val="25"/>
+      </w:rPr>
+      <w:fldChar w:fldCharType="begin"/>
+      <w:instrText xml:space="preserve">PAGE</w:instrText>
+      <w:fldChar w:fldCharType="separate"/>
+      <w:fldChar w:fldCharType="end"/>
+    </w:r>
+  </w:p>
+</w:ftr>
+</file>
+
+<file path=word/footer7.xml><?xml version="1.0" encoding="utf-8"?>
+<w:ftr xmlns:wpc="http://schemas.microsoft.com/office/word/2010/wordprocessingCanvas" xmlns:mc="http://schemas.openxmlformats.org/markup-compatibility/2006" xmlns:o="urn:schemas-microsoft-com:office:office" xmlns:r="http://schemas.openxmlformats.org/officeDocument/2006/relationships" xmlns:m="http://schemas.openxmlformats.org/officeDocument/2006/math" xmlns:v="urn:schemas-microsoft-com:vml" xmlns:wp14="http://schemas.microsoft.com/office/word/2010/wordprocessingDrawing" xmlns:wp="http://schemas.openxmlformats.org/drawingml/2006/wordprocessingDrawing" xmlns:w10="urn:schemas-microsoft-com:office:word" xmlns:w="http://schemas.openxmlformats.org/wordprocessingml/2006/main" xmlns:w14="http://schemas.microsoft.com/office/word/2010/wordml" xmlns:w15="http://schemas.microsoft.com/office/word/2012/wordml" xmlns:wpg="http://schemas.microsoft.com/office/word/2010/wordprocessingGroup" xmlns:wpi="http://schemas.microsoft.com/office/word/2010/wordprocessingInk" xmlns:wne="http://schemas.microsoft.com/office/word/2006/wordml" xmlns:wps="http://schemas.microsoft.com/office/word/2010/wordprocessingShape">
+  <w:p>
+    <w:pPr>
+      <w:jc w:val="center"/>
+    </w:pPr>
+    <w:r>
+      <w:rPr>
+        <w:rFonts w:ascii="Palatino Linotype" w:cs="Palatino Linotype" w:eastAsia="Palatino Linotype" w:hAnsi="Palatino Linotype"/>
+        <w:color w:val="000000"/>
+        <w:sz w:val="25"/>
+        <w:szCs w:val="25"/>
+      </w:rPr>
+      <w:fldChar w:fldCharType="begin"/>
+      <w:instrText xml:space="preserve">PAGE</w:instrText>
+      <w:fldChar w:fldCharType="separate"/>
+      <w:fldChar w:fldCharType="end"/>
+    </w:r>
+  </w:p>
+</w:ftr>
+</file>
+
+<file path=word/footer8.xml><?xml version="1.0" encoding="utf-8"?>
+<w:ftr xmlns:wpc="http://schemas.microsoft.com/office/word/2010/wordprocessingCanvas" xmlns:mc="http://schemas.openxmlformats.org/markup-compatibility/2006" xmlns:o="urn:schemas-microsoft-com:office:office" xmlns:r="http://schemas.openxmlformats.org/officeDocument/2006/relationships" xmlns:m="http://schemas.openxmlformats.org/officeDocument/2006/math" xmlns:v="urn:schemas-microsoft-com:vml" xmlns:wp14="http://schemas.microsoft.com/office/word/2010/wordprocessingDrawing" xmlns:wp="http://schemas.openxmlformats.org/drawingml/2006/wordprocessingDrawing" xmlns:w10="urn:schemas-microsoft-com:office:word" xmlns:w="http://schemas.openxmlformats.org/wordprocessingml/2006/main" xmlns:w14="http://schemas.microsoft.com/office/word/2010/wordml" xmlns:w15="http://schemas.microsoft.com/office/word/2012/wordml" xmlns:wpg="http://schemas.microsoft.com/office/word/2010/wordprocessingGroup" xmlns:wpi="http://schemas.microsoft.com/office/word/2010/wordprocessingInk" xmlns:wne="http://schemas.microsoft.com/office/word/2006/wordml" xmlns:wps="http://schemas.microsoft.com/office/word/2010/wordprocessingShape">
+  <w:p>
+    <w:pPr>
+      <w:jc w:val="center"/>
+    </w:pPr>
+    <w:r>
+      <w:rPr>
+        <w:rFonts w:ascii="Palatino Linotype" w:cs="Palatino Linotype" w:eastAsia="Palatino Linotype" w:hAnsi="Palatino Linotype"/>
+        <w:color w:val="000000"/>
+        <w:sz w:val="25"/>
+        <w:szCs w:val="25"/>
+      </w:rPr>
+      <w:fldChar w:fldCharType="begin"/>
+      <w:instrText xml:space="preserve">PAGE</w:instrText>
+      <w:fldChar w:fldCharType="separate"/>
+      <w:fldChar w:fldCharType="end"/>
+    </w:r>
+  </w:p>
+</w:ftr>
+</file>
+
+<file path=word/footer9.xml><?xml version="1.0" encoding="utf-8"?>
 <w:ftr xmlns:wpc="http://schemas.microsoft.com/office/word/2010/wordprocessingCanvas" xmlns:mc="http://schemas.openxmlformats.org/markup-compatibility/2006" xmlns:o="urn:schemas-microsoft-com:office:office" xmlns:r="http://schemas.openxmlformats.org/officeDocument/2006/relationships" xmlns:m="http://schemas.openxmlformats.org/officeDocument/2006/math" xmlns:v="urn:schemas-microsoft-com:vml" xmlns:wp14="http://schemas.microsoft.com/office/word/2010/wordprocessingDrawing" xmlns:wp="http://schemas.openxmlformats.org/drawingml/2006/wordprocessingDrawing" xmlns:w10="urn:schemas-microsoft-com:office:word" xmlns:w="http://schemas.openxmlformats.org/wordprocessingml/2006/main" xmlns:w14="http://schemas.microsoft.com/office/word/2010/wordml" xmlns:w15="http://schemas.microsoft.com/office/word/2012/wordml" xmlns:wpg="http://schemas.microsoft.com/office/word/2010/wordprocessingGroup" xmlns:wpi="http://schemas.microsoft.com/office/word/2010/wordprocessingInk" xmlns:wne="http://schemas.microsoft.com/office/word/2006/wordml" xmlns:wps="http://schemas.microsoft.com/office/word/2010/wordprocessingShape">
   <w:p>
     <w:pPr>

</xml_diff>

<commit_message>
Remove page-number footers from generated books
Drops the Footer/PageNumber field entirely rather than just hiding it —
the generated docx now has no footer part at all.

Co-Authored-By: Claude Sonnet 5 <noreply@anthropic.com>
Claude-Session: https://claude.ai/code/session_01EoaKHDQrpBesbDTJKhejKJ
</commit_message>
<xml_diff>
--- a/sample/Blessed-by-Association-formatted.docx
+++ b/sample/Blessed-by-Association-formatted.docx
@@ -233,7 +233,6 @@
     <w:p>
       <w:pPr>
         <w:sectPr>
-          <w:footerReference w:type="default" r:id="rId7"/>
           <w:pgSz w:w="8640" w:h="12960" w:orient="portrait"/>
           <w:pgMar w:top="1152" w:right="1080" w:bottom="1080" w:left="1080" w:header="576" w:footer="576" w:gutter="0"/>
           <w:pgNumType/>
@@ -539,7 +538,6 @@
     <w:p>
       <w:pPr>
         <w:sectPr>
-          <w:footerReference w:type="default" r:id="rId8"/>
           <w:type w:val="oddPage"/>
           <w:pgSz w:w="8640" w:h="12960" w:orient="portrait"/>
           <w:pgMar w:top="1152" w:right="1080" w:bottom="1080" w:left="1080" w:header="576" w:footer="576" w:gutter="0"/>
@@ -1124,7 +1122,6 @@
     <w:p>
       <w:pPr>
         <w:sectPr>
-          <w:footerReference w:type="default" r:id="rId9"/>
           <w:type w:val="oddPage"/>
           <w:pgSz w:w="8640" w:h="12960" w:orient="portrait"/>
           <w:pgMar w:top="1152" w:right="1080" w:bottom="1080" w:left="1080" w:header="576" w:footer="576" w:gutter="0"/>
@@ -1766,7 +1763,6 @@
     <w:p>
       <w:pPr>
         <w:sectPr>
-          <w:footerReference w:type="default" r:id="rId10"/>
           <w:type w:val="oddPage"/>
           <w:pgSz w:w="8640" w:h="12960" w:orient="portrait"/>
           <w:pgMar w:top="1152" w:right="1080" w:bottom="1080" w:left="1080" w:header="576" w:footer="576" w:gutter="0"/>
@@ -2361,7 +2357,6 @@
     <w:p>
       <w:pPr>
         <w:sectPr>
-          <w:footerReference w:type="default" r:id="rId11"/>
           <w:type w:val="oddPage"/>
           <w:pgSz w:w="8640" w:h="12960" w:orient="portrait"/>
           <w:pgMar w:top="1152" w:right="1080" w:bottom="1080" w:left="1080" w:header="576" w:footer="576" w:gutter="0"/>
@@ -2958,7 +2953,6 @@
     <w:p>
       <w:pPr>
         <w:sectPr>
-          <w:footerReference w:type="default" r:id="rId12"/>
           <w:type w:val="oddPage"/>
           <w:pgSz w:w="8640" w:h="12960" w:orient="portrait"/>
           <w:pgMar w:top="1152" w:right="1080" w:bottom="1080" w:left="1080" w:header="576" w:footer="576" w:gutter="0"/>
@@ -3593,7 +3587,6 @@
     <w:p>
       <w:pPr>
         <w:sectPr>
-          <w:footerReference w:type="default" r:id="rId13"/>
           <w:type w:val="oddPage"/>
           <w:pgSz w:w="8640" w:h="12960" w:orient="portrait"/>
           <w:pgMar w:top="1152" w:right="1080" w:bottom="1080" w:left="1080" w:header="576" w:footer="576" w:gutter="0"/>
@@ -4233,7 +4226,6 @@
     <w:p>
       <w:pPr>
         <w:sectPr>
-          <w:footerReference w:type="default" r:id="rId14"/>
           <w:type w:val="oddPage"/>
           <w:pgSz w:w="8640" w:h="12960" w:orient="portrait"/>
           <w:pgMar w:top="1152" w:right="1080" w:bottom="1080" w:left="1080" w:header="576" w:footer="576" w:gutter="0"/>
@@ -4803,7 +4795,6 @@
     <w:p>
       <w:pPr>
         <w:sectPr>
-          <w:footerReference w:type="default" r:id="rId15"/>
           <w:type w:val="oddPage"/>
           <w:pgSz w:w="8640" w:h="12960" w:orient="portrait"/>
           <w:pgMar w:top="1152" w:right="1080" w:bottom="1080" w:left="1080" w:header="576" w:footer="576" w:gutter="0"/>
@@ -5488,7 +5479,6 @@
     <w:p>
       <w:pPr>
         <w:sectPr>
-          <w:footerReference w:type="default" r:id="rId16"/>
           <w:type w:val="oddPage"/>
           <w:pgSz w:w="8640" w:h="12960" w:orient="portrait"/>
           <w:pgMar w:top="1152" w:right="1080" w:bottom="1080" w:left="1080" w:header="576" w:footer="576" w:gutter="0"/>
@@ -6228,7 +6218,6 @@
     <w:p>
       <w:pPr>
         <w:sectPr>
-          <w:footerReference w:type="default" r:id="rId17"/>
           <w:type w:val="oddPage"/>
           <w:pgSz w:w="8640" w:h="12960" w:orient="portrait"/>
           <w:pgMar w:top="1152" w:right="1080" w:bottom="1080" w:left="1080" w:header="576" w:footer="576" w:gutter="0"/>
@@ -6823,7 +6812,6 @@
     <w:p>
       <w:pPr>
         <w:sectPr>
-          <w:footerReference w:type="default" r:id="rId18"/>
           <w:type w:val="oddPage"/>
           <w:pgSz w:w="8640" w:h="12960" w:orient="portrait"/>
           <w:pgMar w:top="1152" w:right="1080" w:bottom="1080" w:left="1080" w:header="576" w:footer="576" w:gutter="0"/>
@@ -7353,7 +7341,6 @@
     <w:p>
       <w:pPr>
         <w:sectPr>
-          <w:footerReference w:type="default" r:id="rId19"/>
           <w:type w:val="oddPage"/>
           <w:pgSz w:w="8640" w:h="12960" w:orient="portrait"/>
           <w:pgMar w:top="1152" w:right="1080" w:bottom="1080" w:left="1080" w:header="576" w:footer="576" w:gutter="0"/>
@@ -7885,7 +7872,6 @@
     <w:p>
       <w:pPr>
         <w:sectPr>
-          <w:footerReference w:type="default" r:id="rId20"/>
           <w:type w:val="oddPage"/>
           <w:pgSz w:w="8640" w:h="12960" w:orient="portrait"/>
           <w:pgMar w:top="1152" w:right="1080" w:bottom="1080" w:left="1080" w:header="576" w:footer="576" w:gutter="0"/>
@@ -8512,7 +8498,6 @@
     <w:p>
       <w:pPr>
         <w:sectPr>
-          <w:footerReference w:type="default" r:id="rId21"/>
           <w:type w:val="oddPage"/>
           <w:pgSz w:w="8640" w:h="12960" w:orient="portrait"/>
           <w:pgMar w:top="1152" w:right="1080" w:bottom="1080" w:left="1080" w:header="576" w:footer="576" w:gutter="0"/>
@@ -9207,7 +9192,6 @@
     <w:p>
       <w:pPr>
         <w:sectPr>
-          <w:footerReference w:type="default" r:id="rId22"/>
           <w:type w:val="oddPage"/>
           <w:pgSz w:w="8640" w:h="12960" w:orient="portrait"/>
           <w:pgMar w:top="1152" w:right="1080" w:bottom="1080" w:left="1080" w:header="576" w:footer="576" w:gutter="0"/>
@@ -10132,7 +10116,6 @@
     <w:p>
       <w:pPr>
         <w:sectPr>
-          <w:footerReference w:type="default" r:id="rId23"/>
           <w:type w:val="oddPage"/>
           <w:pgSz w:w="8640" w:h="12960" w:orient="portrait"/>
           <w:pgMar w:top="1152" w:right="1080" w:bottom="1080" w:left="1080" w:header="576" w:footer="576" w:gutter="0"/>
@@ -10227,7 +10210,6 @@
       </w:r>
     </w:p>
     <w:sectPr>
-      <w:footerReference w:type="default" r:id="rId24"/>
       <w:type w:val="nextPage"/>
       <w:pgSz w:w="8640" w:h="12960" w:orient="portrait"/>
       <w:pgMar w:top="1152" w:right="1080" w:bottom="1080" w:left="1080" w:header="576" w:footer="576" w:gutter="0"/>
@@ -10277,402 +10259,6 @@
     </w:p>
   </w:endnote>
 </w:endnotes>
-</file>
-
-<file path=word/footer1.xml><?xml version="1.0" encoding="utf-8"?>
-<w:ftr xmlns:wpc="http://schemas.microsoft.com/office/word/2010/wordprocessingCanvas" xmlns:mc="http://schemas.openxmlformats.org/markup-compatibility/2006" xmlns:o="urn:schemas-microsoft-com:office:office" xmlns:r="http://schemas.openxmlformats.org/officeDocument/2006/relationships" xmlns:m="http://schemas.openxmlformats.org/officeDocument/2006/math" xmlns:v="urn:schemas-microsoft-com:vml" xmlns:wp14="http://schemas.microsoft.com/office/word/2010/wordprocessingDrawing" xmlns:wp="http://schemas.openxmlformats.org/drawingml/2006/wordprocessingDrawing" xmlns:w10="urn:schemas-microsoft-com:office:word" xmlns:w="http://schemas.openxmlformats.org/wordprocessingml/2006/main" xmlns:w14="http://schemas.microsoft.com/office/word/2010/wordml" xmlns:w15="http://schemas.microsoft.com/office/word/2012/wordml" xmlns:wpg="http://schemas.microsoft.com/office/word/2010/wordprocessingGroup" xmlns:wpi="http://schemas.microsoft.com/office/word/2010/wordprocessingInk" xmlns:wne="http://schemas.microsoft.com/office/word/2006/wordml" xmlns:wps="http://schemas.microsoft.com/office/word/2010/wordprocessingShape">
-  <w:p>
-    <w:pPr>
-      <w:jc w:val="center"/>
-    </w:pPr>
-    <w:r>
-      <w:rPr>
-        <w:rFonts w:ascii="Palatino Linotype" w:cs="Palatino Linotype" w:eastAsia="Palatino Linotype" w:hAnsi="Palatino Linotype"/>
-        <w:color w:val="000000"/>
-        <w:sz w:val="25"/>
-        <w:szCs w:val="25"/>
-      </w:rPr>
-      <w:fldChar w:fldCharType="begin"/>
-      <w:instrText xml:space="preserve">PAGE</w:instrText>
-      <w:fldChar w:fldCharType="separate"/>
-      <w:fldChar w:fldCharType="end"/>
-    </w:r>
-  </w:p>
-</w:ftr>
-</file>
-
-<file path=word/footer10.xml><?xml version="1.0" encoding="utf-8"?>
-<w:ftr xmlns:wpc="http://schemas.microsoft.com/office/word/2010/wordprocessingCanvas" xmlns:mc="http://schemas.openxmlformats.org/markup-compatibility/2006" xmlns:o="urn:schemas-microsoft-com:office:office" xmlns:r="http://schemas.openxmlformats.org/officeDocument/2006/relationships" xmlns:m="http://schemas.openxmlformats.org/officeDocument/2006/math" xmlns:v="urn:schemas-microsoft-com:vml" xmlns:wp14="http://schemas.microsoft.com/office/word/2010/wordprocessingDrawing" xmlns:wp="http://schemas.openxmlformats.org/drawingml/2006/wordprocessingDrawing" xmlns:w10="urn:schemas-microsoft-com:office:word" xmlns:w="http://schemas.openxmlformats.org/wordprocessingml/2006/main" xmlns:w14="http://schemas.microsoft.com/office/word/2010/wordml" xmlns:w15="http://schemas.microsoft.com/office/word/2012/wordml" xmlns:wpg="http://schemas.microsoft.com/office/word/2010/wordprocessingGroup" xmlns:wpi="http://schemas.microsoft.com/office/word/2010/wordprocessingInk" xmlns:wne="http://schemas.microsoft.com/office/word/2006/wordml" xmlns:wps="http://schemas.microsoft.com/office/word/2010/wordprocessingShape">
-  <w:p>
-    <w:pPr>
-      <w:jc w:val="center"/>
-    </w:pPr>
-    <w:r>
-      <w:rPr>
-        <w:rFonts w:ascii="Palatino Linotype" w:cs="Palatino Linotype" w:eastAsia="Palatino Linotype" w:hAnsi="Palatino Linotype"/>
-        <w:color w:val="000000"/>
-        <w:sz w:val="25"/>
-        <w:szCs w:val="25"/>
-      </w:rPr>
-      <w:fldChar w:fldCharType="begin"/>
-      <w:instrText xml:space="preserve">PAGE</w:instrText>
-      <w:fldChar w:fldCharType="separate"/>
-      <w:fldChar w:fldCharType="end"/>
-    </w:r>
-  </w:p>
-</w:ftr>
-</file>
-
-<file path=word/footer11.xml><?xml version="1.0" encoding="utf-8"?>
-<w:ftr xmlns:wpc="http://schemas.microsoft.com/office/word/2010/wordprocessingCanvas" xmlns:mc="http://schemas.openxmlformats.org/markup-compatibility/2006" xmlns:o="urn:schemas-microsoft-com:office:office" xmlns:r="http://schemas.openxmlformats.org/officeDocument/2006/relationships" xmlns:m="http://schemas.openxmlformats.org/officeDocument/2006/math" xmlns:v="urn:schemas-microsoft-com:vml" xmlns:wp14="http://schemas.microsoft.com/office/word/2010/wordprocessingDrawing" xmlns:wp="http://schemas.openxmlformats.org/drawingml/2006/wordprocessingDrawing" xmlns:w10="urn:schemas-microsoft-com:office:word" xmlns:w="http://schemas.openxmlformats.org/wordprocessingml/2006/main" xmlns:w14="http://schemas.microsoft.com/office/word/2010/wordml" xmlns:w15="http://schemas.microsoft.com/office/word/2012/wordml" xmlns:wpg="http://schemas.microsoft.com/office/word/2010/wordprocessingGroup" xmlns:wpi="http://schemas.microsoft.com/office/word/2010/wordprocessingInk" xmlns:wne="http://schemas.microsoft.com/office/word/2006/wordml" xmlns:wps="http://schemas.microsoft.com/office/word/2010/wordprocessingShape">
-  <w:p>
-    <w:pPr>
-      <w:jc w:val="center"/>
-    </w:pPr>
-    <w:r>
-      <w:rPr>
-        <w:rFonts w:ascii="Palatino Linotype" w:cs="Palatino Linotype" w:eastAsia="Palatino Linotype" w:hAnsi="Palatino Linotype"/>
-        <w:color w:val="000000"/>
-        <w:sz w:val="25"/>
-        <w:szCs w:val="25"/>
-      </w:rPr>
-      <w:fldChar w:fldCharType="begin"/>
-      <w:instrText xml:space="preserve">PAGE</w:instrText>
-      <w:fldChar w:fldCharType="separate"/>
-      <w:fldChar w:fldCharType="end"/>
-    </w:r>
-  </w:p>
-</w:ftr>
-</file>
-
-<file path=word/footer12.xml><?xml version="1.0" encoding="utf-8"?>
-<w:ftr xmlns:wpc="http://schemas.microsoft.com/office/word/2010/wordprocessingCanvas" xmlns:mc="http://schemas.openxmlformats.org/markup-compatibility/2006" xmlns:o="urn:schemas-microsoft-com:office:office" xmlns:r="http://schemas.openxmlformats.org/officeDocument/2006/relationships" xmlns:m="http://schemas.openxmlformats.org/officeDocument/2006/math" xmlns:v="urn:schemas-microsoft-com:vml" xmlns:wp14="http://schemas.microsoft.com/office/word/2010/wordprocessingDrawing" xmlns:wp="http://schemas.openxmlformats.org/drawingml/2006/wordprocessingDrawing" xmlns:w10="urn:schemas-microsoft-com:office:word" xmlns:w="http://schemas.openxmlformats.org/wordprocessingml/2006/main" xmlns:w14="http://schemas.microsoft.com/office/word/2010/wordml" xmlns:w15="http://schemas.microsoft.com/office/word/2012/wordml" xmlns:wpg="http://schemas.microsoft.com/office/word/2010/wordprocessingGroup" xmlns:wpi="http://schemas.microsoft.com/office/word/2010/wordprocessingInk" xmlns:wne="http://schemas.microsoft.com/office/word/2006/wordml" xmlns:wps="http://schemas.microsoft.com/office/word/2010/wordprocessingShape">
-  <w:p>
-    <w:pPr>
-      <w:jc w:val="center"/>
-    </w:pPr>
-    <w:r>
-      <w:rPr>
-        <w:rFonts w:ascii="Palatino Linotype" w:cs="Palatino Linotype" w:eastAsia="Palatino Linotype" w:hAnsi="Palatino Linotype"/>
-        <w:color w:val="000000"/>
-        <w:sz w:val="25"/>
-        <w:szCs w:val="25"/>
-      </w:rPr>
-      <w:fldChar w:fldCharType="begin"/>
-      <w:instrText xml:space="preserve">PAGE</w:instrText>
-      <w:fldChar w:fldCharType="separate"/>
-      <w:fldChar w:fldCharType="end"/>
-    </w:r>
-  </w:p>
-</w:ftr>
-</file>
-
-<file path=word/footer13.xml><?xml version="1.0" encoding="utf-8"?>
-<w:ftr xmlns:wpc="http://schemas.microsoft.com/office/word/2010/wordprocessingCanvas" xmlns:mc="http://schemas.openxmlformats.org/markup-compatibility/2006" xmlns:o="urn:schemas-microsoft-com:office:office" xmlns:r="http://schemas.openxmlformats.org/officeDocument/2006/relationships" xmlns:m="http://schemas.openxmlformats.org/officeDocument/2006/math" xmlns:v="urn:schemas-microsoft-com:vml" xmlns:wp14="http://schemas.microsoft.com/office/word/2010/wordprocessingDrawing" xmlns:wp="http://schemas.openxmlformats.org/drawingml/2006/wordprocessingDrawing" xmlns:w10="urn:schemas-microsoft-com:office:word" xmlns:w="http://schemas.openxmlformats.org/wordprocessingml/2006/main" xmlns:w14="http://schemas.microsoft.com/office/word/2010/wordml" xmlns:w15="http://schemas.microsoft.com/office/word/2012/wordml" xmlns:wpg="http://schemas.microsoft.com/office/word/2010/wordprocessingGroup" xmlns:wpi="http://schemas.microsoft.com/office/word/2010/wordprocessingInk" xmlns:wne="http://schemas.microsoft.com/office/word/2006/wordml" xmlns:wps="http://schemas.microsoft.com/office/word/2010/wordprocessingShape">
-  <w:p>
-    <w:pPr>
-      <w:jc w:val="center"/>
-    </w:pPr>
-    <w:r>
-      <w:rPr>
-        <w:rFonts w:ascii="Palatino Linotype" w:cs="Palatino Linotype" w:eastAsia="Palatino Linotype" w:hAnsi="Palatino Linotype"/>
-        <w:color w:val="000000"/>
-        <w:sz w:val="25"/>
-        <w:szCs w:val="25"/>
-      </w:rPr>
-      <w:fldChar w:fldCharType="begin"/>
-      <w:instrText xml:space="preserve">PAGE</w:instrText>
-      <w:fldChar w:fldCharType="separate"/>
-      <w:fldChar w:fldCharType="end"/>
-    </w:r>
-  </w:p>
-</w:ftr>
-</file>
-
-<file path=word/footer14.xml><?xml version="1.0" encoding="utf-8"?>
-<w:ftr xmlns:wpc="http://schemas.microsoft.com/office/word/2010/wordprocessingCanvas" xmlns:mc="http://schemas.openxmlformats.org/markup-compatibility/2006" xmlns:o="urn:schemas-microsoft-com:office:office" xmlns:r="http://schemas.openxmlformats.org/officeDocument/2006/relationships" xmlns:m="http://schemas.openxmlformats.org/officeDocument/2006/math" xmlns:v="urn:schemas-microsoft-com:vml" xmlns:wp14="http://schemas.microsoft.com/office/word/2010/wordprocessingDrawing" xmlns:wp="http://schemas.openxmlformats.org/drawingml/2006/wordprocessingDrawing" xmlns:w10="urn:schemas-microsoft-com:office:word" xmlns:w="http://schemas.openxmlformats.org/wordprocessingml/2006/main" xmlns:w14="http://schemas.microsoft.com/office/word/2010/wordml" xmlns:w15="http://schemas.microsoft.com/office/word/2012/wordml" xmlns:wpg="http://schemas.microsoft.com/office/word/2010/wordprocessingGroup" xmlns:wpi="http://schemas.microsoft.com/office/word/2010/wordprocessingInk" xmlns:wne="http://schemas.microsoft.com/office/word/2006/wordml" xmlns:wps="http://schemas.microsoft.com/office/word/2010/wordprocessingShape">
-  <w:p>
-    <w:pPr>
-      <w:jc w:val="center"/>
-    </w:pPr>
-    <w:r>
-      <w:rPr>
-        <w:rFonts w:ascii="Palatino Linotype" w:cs="Palatino Linotype" w:eastAsia="Palatino Linotype" w:hAnsi="Palatino Linotype"/>
-        <w:color w:val="000000"/>
-        <w:sz w:val="25"/>
-        <w:szCs w:val="25"/>
-      </w:rPr>
-      <w:fldChar w:fldCharType="begin"/>
-      <w:instrText xml:space="preserve">PAGE</w:instrText>
-      <w:fldChar w:fldCharType="separate"/>
-      <w:fldChar w:fldCharType="end"/>
-    </w:r>
-  </w:p>
-</w:ftr>
-</file>
-
-<file path=word/footer15.xml><?xml version="1.0" encoding="utf-8"?>
-<w:ftr xmlns:wpc="http://schemas.microsoft.com/office/word/2010/wordprocessingCanvas" xmlns:mc="http://schemas.openxmlformats.org/markup-compatibility/2006" xmlns:o="urn:schemas-microsoft-com:office:office" xmlns:r="http://schemas.openxmlformats.org/officeDocument/2006/relationships" xmlns:m="http://schemas.openxmlformats.org/officeDocument/2006/math" xmlns:v="urn:schemas-microsoft-com:vml" xmlns:wp14="http://schemas.microsoft.com/office/word/2010/wordprocessingDrawing" xmlns:wp="http://schemas.openxmlformats.org/drawingml/2006/wordprocessingDrawing" xmlns:w10="urn:schemas-microsoft-com:office:word" xmlns:w="http://schemas.openxmlformats.org/wordprocessingml/2006/main" xmlns:w14="http://schemas.microsoft.com/office/word/2010/wordml" xmlns:w15="http://schemas.microsoft.com/office/word/2012/wordml" xmlns:wpg="http://schemas.microsoft.com/office/word/2010/wordprocessingGroup" xmlns:wpi="http://schemas.microsoft.com/office/word/2010/wordprocessingInk" xmlns:wne="http://schemas.microsoft.com/office/word/2006/wordml" xmlns:wps="http://schemas.microsoft.com/office/word/2010/wordprocessingShape">
-  <w:p>
-    <w:pPr>
-      <w:jc w:val="center"/>
-    </w:pPr>
-    <w:r>
-      <w:rPr>
-        <w:rFonts w:ascii="Palatino Linotype" w:cs="Palatino Linotype" w:eastAsia="Palatino Linotype" w:hAnsi="Palatino Linotype"/>
-        <w:color w:val="000000"/>
-        <w:sz w:val="25"/>
-        <w:szCs w:val="25"/>
-      </w:rPr>
-      <w:fldChar w:fldCharType="begin"/>
-      <w:instrText xml:space="preserve">PAGE</w:instrText>
-      <w:fldChar w:fldCharType="separate"/>
-      <w:fldChar w:fldCharType="end"/>
-    </w:r>
-  </w:p>
-</w:ftr>
-</file>
-
-<file path=word/footer16.xml><?xml version="1.0" encoding="utf-8"?>
-<w:ftr xmlns:wpc="http://schemas.microsoft.com/office/word/2010/wordprocessingCanvas" xmlns:mc="http://schemas.openxmlformats.org/markup-compatibility/2006" xmlns:o="urn:schemas-microsoft-com:office:office" xmlns:r="http://schemas.openxmlformats.org/officeDocument/2006/relationships" xmlns:m="http://schemas.openxmlformats.org/officeDocument/2006/math" xmlns:v="urn:schemas-microsoft-com:vml" xmlns:wp14="http://schemas.microsoft.com/office/word/2010/wordprocessingDrawing" xmlns:wp="http://schemas.openxmlformats.org/drawingml/2006/wordprocessingDrawing" xmlns:w10="urn:schemas-microsoft-com:office:word" xmlns:w="http://schemas.openxmlformats.org/wordprocessingml/2006/main" xmlns:w14="http://schemas.microsoft.com/office/word/2010/wordml" xmlns:w15="http://schemas.microsoft.com/office/word/2012/wordml" xmlns:wpg="http://schemas.microsoft.com/office/word/2010/wordprocessingGroup" xmlns:wpi="http://schemas.microsoft.com/office/word/2010/wordprocessingInk" xmlns:wne="http://schemas.microsoft.com/office/word/2006/wordml" xmlns:wps="http://schemas.microsoft.com/office/word/2010/wordprocessingShape">
-  <w:p>
-    <w:pPr>
-      <w:jc w:val="center"/>
-    </w:pPr>
-    <w:r>
-      <w:rPr>
-        <w:rFonts w:ascii="Palatino Linotype" w:cs="Palatino Linotype" w:eastAsia="Palatino Linotype" w:hAnsi="Palatino Linotype"/>
-        <w:color w:val="000000"/>
-        <w:sz w:val="25"/>
-        <w:szCs w:val="25"/>
-      </w:rPr>
-      <w:fldChar w:fldCharType="begin"/>
-      <w:instrText xml:space="preserve">PAGE</w:instrText>
-      <w:fldChar w:fldCharType="separate"/>
-      <w:fldChar w:fldCharType="end"/>
-    </w:r>
-  </w:p>
-</w:ftr>
-</file>
-
-<file path=word/footer17.xml><?xml version="1.0" encoding="utf-8"?>
-<w:ftr xmlns:wpc="http://schemas.microsoft.com/office/word/2010/wordprocessingCanvas" xmlns:mc="http://schemas.openxmlformats.org/markup-compatibility/2006" xmlns:o="urn:schemas-microsoft-com:office:office" xmlns:r="http://schemas.openxmlformats.org/officeDocument/2006/relationships" xmlns:m="http://schemas.openxmlformats.org/officeDocument/2006/math" xmlns:v="urn:schemas-microsoft-com:vml" xmlns:wp14="http://schemas.microsoft.com/office/word/2010/wordprocessingDrawing" xmlns:wp="http://schemas.openxmlformats.org/drawingml/2006/wordprocessingDrawing" xmlns:w10="urn:schemas-microsoft-com:office:word" xmlns:w="http://schemas.openxmlformats.org/wordprocessingml/2006/main" xmlns:w14="http://schemas.microsoft.com/office/word/2010/wordml" xmlns:w15="http://schemas.microsoft.com/office/word/2012/wordml" xmlns:wpg="http://schemas.microsoft.com/office/word/2010/wordprocessingGroup" xmlns:wpi="http://schemas.microsoft.com/office/word/2010/wordprocessingInk" xmlns:wne="http://schemas.microsoft.com/office/word/2006/wordml" xmlns:wps="http://schemas.microsoft.com/office/word/2010/wordprocessingShape">
-  <w:p>
-    <w:pPr>
-      <w:jc w:val="center"/>
-    </w:pPr>
-    <w:r>
-      <w:rPr>
-        <w:rFonts w:ascii="Palatino Linotype" w:cs="Palatino Linotype" w:eastAsia="Palatino Linotype" w:hAnsi="Palatino Linotype"/>
-        <w:color w:val="000000"/>
-        <w:sz w:val="25"/>
-        <w:szCs w:val="25"/>
-      </w:rPr>
-      <w:fldChar w:fldCharType="begin"/>
-      <w:instrText xml:space="preserve">PAGE</w:instrText>
-      <w:fldChar w:fldCharType="separate"/>
-      <w:fldChar w:fldCharType="end"/>
-    </w:r>
-  </w:p>
-</w:ftr>
-</file>
-
-<file path=word/footer18.xml><?xml version="1.0" encoding="utf-8"?>
-<w:ftr xmlns:wpc="http://schemas.microsoft.com/office/word/2010/wordprocessingCanvas" xmlns:mc="http://schemas.openxmlformats.org/markup-compatibility/2006" xmlns:o="urn:schemas-microsoft-com:office:office" xmlns:r="http://schemas.openxmlformats.org/officeDocument/2006/relationships" xmlns:m="http://schemas.openxmlformats.org/officeDocument/2006/math" xmlns:v="urn:schemas-microsoft-com:vml" xmlns:wp14="http://schemas.microsoft.com/office/word/2010/wordprocessingDrawing" xmlns:wp="http://schemas.openxmlformats.org/drawingml/2006/wordprocessingDrawing" xmlns:w10="urn:schemas-microsoft-com:office:word" xmlns:w="http://schemas.openxmlformats.org/wordprocessingml/2006/main" xmlns:w14="http://schemas.microsoft.com/office/word/2010/wordml" xmlns:w15="http://schemas.microsoft.com/office/word/2012/wordml" xmlns:wpg="http://schemas.microsoft.com/office/word/2010/wordprocessingGroup" xmlns:wpi="http://schemas.microsoft.com/office/word/2010/wordprocessingInk" xmlns:wne="http://schemas.microsoft.com/office/word/2006/wordml" xmlns:wps="http://schemas.microsoft.com/office/word/2010/wordprocessingShape">
-  <w:p>
-    <w:pPr>
-      <w:jc w:val="center"/>
-    </w:pPr>
-    <w:r>
-      <w:rPr>
-        <w:rFonts w:ascii="Palatino Linotype" w:cs="Palatino Linotype" w:eastAsia="Palatino Linotype" w:hAnsi="Palatino Linotype"/>
-        <w:color w:val="000000"/>
-        <w:sz w:val="25"/>
-        <w:szCs w:val="25"/>
-      </w:rPr>
-      <w:fldChar w:fldCharType="begin"/>
-      <w:instrText xml:space="preserve">PAGE</w:instrText>
-      <w:fldChar w:fldCharType="separate"/>
-      <w:fldChar w:fldCharType="end"/>
-    </w:r>
-  </w:p>
-</w:ftr>
-</file>
-
-<file path=word/footer2.xml><?xml version="1.0" encoding="utf-8"?>
-<w:ftr xmlns:wpc="http://schemas.microsoft.com/office/word/2010/wordprocessingCanvas" xmlns:mc="http://schemas.openxmlformats.org/markup-compatibility/2006" xmlns:o="urn:schemas-microsoft-com:office:office" xmlns:r="http://schemas.openxmlformats.org/officeDocument/2006/relationships" xmlns:m="http://schemas.openxmlformats.org/officeDocument/2006/math" xmlns:v="urn:schemas-microsoft-com:vml" xmlns:wp14="http://schemas.microsoft.com/office/word/2010/wordprocessingDrawing" xmlns:wp="http://schemas.openxmlformats.org/drawingml/2006/wordprocessingDrawing" xmlns:w10="urn:schemas-microsoft-com:office:word" xmlns:w="http://schemas.openxmlformats.org/wordprocessingml/2006/main" xmlns:w14="http://schemas.microsoft.com/office/word/2010/wordml" xmlns:w15="http://schemas.microsoft.com/office/word/2012/wordml" xmlns:wpg="http://schemas.microsoft.com/office/word/2010/wordprocessingGroup" xmlns:wpi="http://schemas.microsoft.com/office/word/2010/wordprocessingInk" xmlns:wne="http://schemas.microsoft.com/office/word/2006/wordml" xmlns:wps="http://schemas.microsoft.com/office/word/2010/wordprocessingShape">
-  <w:p>
-    <w:pPr>
-      <w:jc w:val="center"/>
-    </w:pPr>
-    <w:r>
-      <w:rPr>
-        <w:rFonts w:ascii="Palatino Linotype" w:cs="Palatino Linotype" w:eastAsia="Palatino Linotype" w:hAnsi="Palatino Linotype"/>
-        <w:color w:val="000000"/>
-        <w:sz w:val="25"/>
-        <w:szCs w:val="25"/>
-      </w:rPr>
-      <w:fldChar w:fldCharType="begin"/>
-      <w:instrText xml:space="preserve">PAGE</w:instrText>
-      <w:fldChar w:fldCharType="separate"/>
-      <w:fldChar w:fldCharType="end"/>
-    </w:r>
-  </w:p>
-</w:ftr>
-</file>
-
-<file path=word/footer3.xml><?xml version="1.0" encoding="utf-8"?>
-<w:ftr xmlns:wpc="http://schemas.microsoft.com/office/word/2010/wordprocessingCanvas" xmlns:mc="http://schemas.openxmlformats.org/markup-compatibility/2006" xmlns:o="urn:schemas-microsoft-com:office:office" xmlns:r="http://schemas.openxmlformats.org/officeDocument/2006/relationships" xmlns:m="http://schemas.openxmlformats.org/officeDocument/2006/math" xmlns:v="urn:schemas-microsoft-com:vml" xmlns:wp14="http://schemas.microsoft.com/office/word/2010/wordprocessingDrawing" xmlns:wp="http://schemas.openxmlformats.org/drawingml/2006/wordprocessingDrawing" xmlns:w10="urn:schemas-microsoft-com:office:word" xmlns:w="http://schemas.openxmlformats.org/wordprocessingml/2006/main" xmlns:w14="http://schemas.microsoft.com/office/word/2010/wordml" xmlns:w15="http://schemas.microsoft.com/office/word/2012/wordml" xmlns:wpg="http://schemas.microsoft.com/office/word/2010/wordprocessingGroup" xmlns:wpi="http://schemas.microsoft.com/office/word/2010/wordprocessingInk" xmlns:wne="http://schemas.microsoft.com/office/word/2006/wordml" xmlns:wps="http://schemas.microsoft.com/office/word/2010/wordprocessingShape">
-  <w:p>
-    <w:pPr>
-      <w:jc w:val="center"/>
-    </w:pPr>
-    <w:r>
-      <w:rPr>
-        <w:rFonts w:ascii="Palatino Linotype" w:cs="Palatino Linotype" w:eastAsia="Palatino Linotype" w:hAnsi="Palatino Linotype"/>
-        <w:color w:val="000000"/>
-        <w:sz w:val="25"/>
-        <w:szCs w:val="25"/>
-      </w:rPr>
-      <w:fldChar w:fldCharType="begin"/>
-      <w:instrText xml:space="preserve">PAGE</w:instrText>
-      <w:fldChar w:fldCharType="separate"/>
-      <w:fldChar w:fldCharType="end"/>
-    </w:r>
-  </w:p>
-</w:ftr>
-</file>
-
-<file path=word/footer4.xml><?xml version="1.0" encoding="utf-8"?>
-<w:ftr xmlns:wpc="http://schemas.microsoft.com/office/word/2010/wordprocessingCanvas" xmlns:mc="http://schemas.openxmlformats.org/markup-compatibility/2006" xmlns:o="urn:schemas-microsoft-com:office:office" xmlns:r="http://schemas.openxmlformats.org/officeDocument/2006/relationships" xmlns:m="http://schemas.openxmlformats.org/officeDocument/2006/math" xmlns:v="urn:schemas-microsoft-com:vml" xmlns:wp14="http://schemas.microsoft.com/office/word/2010/wordprocessingDrawing" xmlns:wp="http://schemas.openxmlformats.org/drawingml/2006/wordprocessingDrawing" xmlns:w10="urn:schemas-microsoft-com:office:word" xmlns:w="http://schemas.openxmlformats.org/wordprocessingml/2006/main" xmlns:w14="http://schemas.microsoft.com/office/word/2010/wordml" xmlns:w15="http://schemas.microsoft.com/office/word/2012/wordml" xmlns:wpg="http://schemas.microsoft.com/office/word/2010/wordprocessingGroup" xmlns:wpi="http://schemas.microsoft.com/office/word/2010/wordprocessingInk" xmlns:wne="http://schemas.microsoft.com/office/word/2006/wordml" xmlns:wps="http://schemas.microsoft.com/office/word/2010/wordprocessingShape">
-  <w:p>
-    <w:pPr>
-      <w:jc w:val="center"/>
-    </w:pPr>
-    <w:r>
-      <w:rPr>
-        <w:rFonts w:ascii="Palatino Linotype" w:cs="Palatino Linotype" w:eastAsia="Palatino Linotype" w:hAnsi="Palatino Linotype"/>
-        <w:color w:val="000000"/>
-        <w:sz w:val="25"/>
-        <w:szCs w:val="25"/>
-      </w:rPr>
-      <w:fldChar w:fldCharType="begin"/>
-      <w:instrText xml:space="preserve">PAGE</w:instrText>
-      <w:fldChar w:fldCharType="separate"/>
-      <w:fldChar w:fldCharType="end"/>
-    </w:r>
-  </w:p>
-</w:ftr>
-</file>
-
-<file path=word/footer5.xml><?xml version="1.0" encoding="utf-8"?>
-<w:ftr xmlns:wpc="http://schemas.microsoft.com/office/word/2010/wordprocessingCanvas" xmlns:mc="http://schemas.openxmlformats.org/markup-compatibility/2006" xmlns:o="urn:schemas-microsoft-com:office:office" xmlns:r="http://schemas.openxmlformats.org/officeDocument/2006/relationships" xmlns:m="http://schemas.openxmlformats.org/officeDocument/2006/math" xmlns:v="urn:schemas-microsoft-com:vml" xmlns:wp14="http://schemas.microsoft.com/office/word/2010/wordprocessingDrawing" xmlns:wp="http://schemas.openxmlformats.org/drawingml/2006/wordprocessingDrawing" xmlns:w10="urn:schemas-microsoft-com:office:word" xmlns:w="http://schemas.openxmlformats.org/wordprocessingml/2006/main" xmlns:w14="http://schemas.microsoft.com/office/word/2010/wordml" xmlns:w15="http://schemas.microsoft.com/office/word/2012/wordml" xmlns:wpg="http://schemas.microsoft.com/office/word/2010/wordprocessingGroup" xmlns:wpi="http://schemas.microsoft.com/office/word/2010/wordprocessingInk" xmlns:wne="http://schemas.microsoft.com/office/word/2006/wordml" xmlns:wps="http://schemas.microsoft.com/office/word/2010/wordprocessingShape">
-  <w:p>
-    <w:pPr>
-      <w:jc w:val="center"/>
-    </w:pPr>
-    <w:r>
-      <w:rPr>
-        <w:rFonts w:ascii="Palatino Linotype" w:cs="Palatino Linotype" w:eastAsia="Palatino Linotype" w:hAnsi="Palatino Linotype"/>
-        <w:color w:val="000000"/>
-        <w:sz w:val="25"/>
-        <w:szCs w:val="25"/>
-      </w:rPr>
-      <w:fldChar w:fldCharType="begin"/>
-      <w:instrText xml:space="preserve">PAGE</w:instrText>
-      <w:fldChar w:fldCharType="separate"/>
-      <w:fldChar w:fldCharType="end"/>
-    </w:r>
-  </w:p>
-</w:ftr>
-</file>
-
-<file path=word/footer6.xml><?xml version="1.0" encoding="utf-8"?>
-<w:ftr xmlns:wpc="http://schemas.microsoft.com/office/word/2010/wordprocessingCanvas" xmlns:mc="http://schemas.openxmlformats.org/markup-compatibility/2006" xmlns:o="urn:schemas-microsoft-com:office:office" xmlns:r="http://schemas.openxmlformats.org/officeDocument/2006/relationships" xmlns:m="http://schemas.openxmlformats.org/officeDocument/2006/math" xmlns:v="urn:schemas-microsoft-com:vml" xmlns:wp14="http://schemas.microsoft.com/office/word/2010/wordprocessingDrawing" xmlns:wp="http://schemas.openxmlformats.org/drawingml/2006/wordprocessingDrawing" xmlns:w10="urn:schemas-microsoft-com:office:word" xmlns:w="http://schemas.openxmlformats.org/wordprocessingml/2006/main" xmlns:w14="http://schemas.microsoft.com/office/word/2010/wordml" xmlns:w15="http://schemas.microsoft.com/office/word/2012/wordml" xmlns:wpg="http://schemas.microsoft.com/office/word/2010/wordprocessingGroup" xmlns:wpi="http://schemas.microsoft.com/office/word/2010/wordprocessingInk" xmlns:wne="http://schemas.microsoft.com/office/word/2006/wordml" xmlns:wps="http://schemas.microsoft.com/office/word/2010/wordprocessingShape">
-  <w:p>
-    <w:pPr>
-      <w:jc w:val="center"/>
-    </w:pPr>
-    <w:r>
-      <w:rPr>
-        <w:rFonts w:ascii="Palatino Linotype" w:cs="Palatino Linotype" w:eastAsia="Palatino Linotype" w:hAnsi="Palatino Linotype"/>
-        <w:color w:val="000000"/>
-        <w:sz w:val="25"/>
-        <w:szCs w:val="25"/>
-      </w:rPr>
-      <w:fldChar w:fldCharType="begin"/>
-      <w:instrText xml:space="preserve">PAGE</w:instrText>
-      <w:fldChar w:fldCharType="separate"/>
-      <w:fldChar w:fldCharType="end"/>
-    </w:r>
-  </w:p>
-</w:ftr>
-</file>
-
-<file path=word/footer7.xml><?xml version="1.0" encoding="utf-8"?>
-<w:ftr xmlns:wpc="http://schemas.microsoft.com/office/word/2010/wordprocessingCanvas" xmlns:mc="http://schemas.openxmlformats.org/markup-compatibility/2006" xmlns:o="urn:schemas-microsoft-com:office:office" xmlns:r="http://schemas.openxmlformats.org/officeDocument/2006/relationships" xmlns:m="http://schemas.openxmlformats.org/officeDocument/2006/math" xmlns:v="urn:schemas-microsoft-com:vml" xmlns:wp14="http://schemas.microsoft.com/office/word/2010/wordprocessingDrawing" xmlns:wp="http://schemas.openxmlformats.org/drawingml/2006/wordprocessingDrawing" xmlns:w10="urn:schemas-microsoft-com:office:word" xmlns:w="http://schemas.openxmlformats.org/wordprocessingml/2006/main" xmlns:w14="http://schemas.microsoft.com/office/word/2010/wordml" xmlns:w15="http://schemas.microsoft.com/office/word/2012/wordml" xmlns:wpg="http://schemas.microsoft.com/office/word/2010/wordprocessingGroup" xmlns:wpi="http://schemas.microsoft.com/office/word/2010/wordprocessingInk" xmlns:wne="http://schemas.microsoft.com/office/word/2006/wordml" xmlns:wps="http://schemas.microsoft.com/office/word/2010/wordprocessingShape">
-  <w:p>
-    <w:pPr>
-      <w:jc w:val="center"/>
-    </w:pPr>
-    <w:r>
-      <w:rPr>
-        <w:rFonts w:ascii="Palatino Linotype" w:cs="Palatino Linotype" w:eastAsia="Palatino Linotype" w:hAnsi="Palatino Linotype"/>
-        <w:color w:val="000000"/>
-        <w:sz w:val="25"/>
-        <w:szCs w:val="25"/>
-      </w:rPr>
-      <w:fldChar w:fldCharType="begin"/>
-      <w:instrText xml:space="preserve">PAGE</w:instrText>
-      <w:fldChar w:fldCharType="separate"/>
-      <w:fldChar w:fldCharType="end"/>
-    </w:r>
-  </w:p>
-</w:ftr>
-</file>
-
-<file path=word/footer8.xml><?xml version="1.0" encoding="utf-8"?>
-<w:ftr xmlns:wpc="http://schemas.microsoft.com/office/word/2010/wordprocessingCanvas" xmlns:mc="http://schemas.openxmlformats.org/markup-compatibility/2006" xmlns:o="urn:schemas-microsoft-com:office:office" xmlns:r="http://schemas.openxmlformats.org/officeDocument/2006/relationships" xmlns:m="http://schemas.openxmlformats.org/officeDocument/2006/math" xmlns:v="urn:schemas-microsoft-com:vml" xmlns:wp14="http://schemas.microsoft.com/office/word/2010/wordprocessingDrawing" xmlns:wp="http://schemas.openxmlformats.org/drawingml/2006/wordprocessingDrawing" xmlns:w10="urn:schemas-microsoft-com:office:word" xmlns:w="http://schemas.openxmlformats.org/wordprocessingml/2006/main" xmlns:w14="http://schemas.microsoft.com/office/word/2010/wordml" xmlns:w15="http://schemas.microsoft.com/office/word/2012/wordml" xmlns:wpg="http://schemas.microsoft.com/office/word/2010/wordprocessingGroup" xmlns:wpi="http://schemas.microsoft.com/office/word/2010/wordprocessingInk" xmlns:wne="http://schemas.microsoft.com/office/word/2006/wordml" xmlns:wps="http://schemas.microsoft.com/office/word/2010/wordprocessingShape">
-  <w:p>
-    <w:pPr>
-      <w:jc w:val="center"/>
-    </w:pPr>
-    <w:r>
-      <w:rPr>
-        <w:rFonts w:ascii="Palatino Linotype" w:cs="Palatino Linotype" w:eastAsia="Palatino Linotype" w:hAnsi="Palatino Linotype"/>
-        <w:color w:val="000000"/>
-        <w:sz w:val="25"/>
-        <w:szCs w:val="25"/>
-      </w:rPr>
-      <w:fldChar w:fldCharType="begin"/>
-      <w:instrText xml:space="preserve">PAGE</w:instrText>
-      <w:fldChar w:fldCharType="separate"/>
-      <w:fldChar w:fldCharType="end"/>
-    </w:r>
-  </w:p>
-</w:ftr>
-</file>
-
-<file path=word/footer9.xml><?xml version="1.0" encoding="utf-8"?>
-<w:ftr xmlns:wpc="http://schemas.microsoft.com/office/word/2010/wordprocessingCanvas" xmlns:mc="http://schemas.openxmlformats.org/markup-compatibility/2006" xmlns:o="urn:schemas-microsoft-com:office:office" xmlns:r="http://schemas.openxmlformats.org/officeDocument/2006/relationships" xmlns:m="http://schemas.openxmlformats.org/officeDocument/2006/math" xmlns:v="urn:schemas-microsoft-com:vml" xmlns:wp14="http://schemas.microsoft.com/office/word/2010/wordprocessingDrawing" xmlns:wp="http://schemas.openxmlformats.org/drawingml/2006/wordprocessingDrawing" xmlns:w10="urn:schemas-microsoft-com:office:word" xmlns:w="http://schemas.openxmlformats.org/wordprocessingml/2006/main" xmlns:w14="http://schemas.microsoft.com/office/word/2010/wordml" xmlns:w15="http://schemas.microsoft.com/office/word/2012/wordml" xmlns:wpg="http://schemas.microsoft.com/office/word/2010/wordprocessingGroup" xmlns:wpi="http://schemas.microsoft.com/office/word/2010/wordprocessingInk" xmlns:wne="http://schemas.microsoft.com/office/word/2006/wordml" xmlns:wps="http://schemas.microsoft.com/office/word/2010/wordprocessingShape">
-  <w:p>
-    <w:pPr>
-      <w:jc w:val="center"/>
-    </w:pPr>
-    <w:r>
-      <w:rPr>
-        <w:rFonts w:ascii="Palatino Linotype" w:cs="Palatino Linotype" w:eastAsia="Palatino Linotype" w:hAnsi="Palatino Linotype"/>
-        <w:color w:val="000000"/>
-        <w:sz w:val="25"/>
-        <w:szCs w:val="25"/>
-      </w:rPr>
-      <w:fldChar w:fldCharType="begin"/>
-      <w:instrText xml:space="preserve">PAGE</w:instrText>
-      <w:fldChar w:fldCharType="separate"/>
-      <w:fldChar w:fldCharType="end"/>
-    </w:r>
-  </w:p>
-</w:ftr>
 </file>
 
 <file path=word/footnotes.xml><?xml version="1.0" encoding="utf-8"?>

</xml_diff>